<commit_message>
Reserva de memoria para evitar la recuperación de instancias ociosas de OCI
</commit_message>
<xml_diff>
--- a/docs/Memoria_PIASIR_Diego_Perez_Fonterosa.docx
+++ b/docs/Memoria_PIASIR_Diego_Perez_Fonterosa.docx
@@ -11984,6 +11984,101 @@
     </w:p>
     <w:p>
       <w:pPr>
+        <w:pStyle w:val="Heading3"/>
+        <w:spacing w:after="240" w:before="240" w:line="360"/>
+        <w:jc w:val="left"/>
+      </w:pPr>
+      <w:r>
+        <w:rPr>
+          <w:rFonts w:ascii="Arial" w:cs="Arial" w:eastAsia="Arial" w:hAnsi="Arial"/>
+          <w:b/>
+          <w:bCs/>
+          <w:i/>
+          <w:iCs/>
+          <w:sz w:val="24"/>
+          <w:szCs w:val="24"/>
+        </w:rPr>
+        <w:t xml:space="preserve">Disponibilidad de Capacidad</w:t>
+      </w:r>
+    </w:p>
+    <w:p>
+      <w:pPr>
+        <w:spacing w:line="360"/>
+        <w:ind w:firstLine="709"/>
+        <w:jc w:val="left"/>
+      </w:pPr>
+      <w:r>
+        <w:rPr>
+          <w:rFonts w:ascii="Arial" w:cs="Arial" w:eastAsia="Arial" w:hAnsi="Arial"/>
+          <w:b w:val="false"/>
+          <w:bCs w:val="false"/>
+          <w:i w:val="false"/>
+          <w:iCs w:val="false"/>
+          <w:sz w:val="24"/>
+          <w:szCs w:val="24"/>
+        </w:rPr>
+        <w:t xml:space="preserve">Las instancias A1.Flex gratuitas son muy demandadas y la región de Madrid respondía de forma sistemática con el error «Out of host capacity». Se valoraron tres alternativas: la instancia gratuita VM.Standard.E2.1.Micro (AMD, 1 GB de RAM), que no aparecía disponible para la cuenta en esa región; el paso a una cuenta Pay As You Go, descartado por exigir una retención temporal de unos 93 € en la tarjeta; y la creación automatizada de la instancia mediante la API de OCI. Se optó por la tercera: el script oci_a1_retry.py, desarrollado con el SDK oficial de Oracle para Python, localiza el dominio de disponibilidad, la imagen Ubuntu 24.04 ARM y la subnet pública, y solicita la instancia cada minuto hasta que hay capacidad, respetando los avisos de limitación de peticiones de la API.</w:t>
+      </w:r>
+    </w:p>
+    <w:p>
+      <w:pPr>
+        <w:pStyle w:val="Heading3"/>
+        <w:spacing w:after="240" w:before="240" w:line="360"/>
+        <w:jc w:val="left"/>
+      </w:pPr>
+      <w:r>
+        <w:rPr>
+          <w:rFonts w:ascii="Arial" w:cs="Arial" w:eastAsia="Arial" w:hAnsi="Arial"/>
+          <w:b/>
+          <w:bCs/>
+          <w:i/>
+          <w:iCs/>
+          <w:sz w:val="24"/>
+          <w:szCs w:val="24"/>
+        </w:rPr>
+        <w:t xml:space="preserve">Recuperación de Instancias Ociosas</w:t>
+      </w:r>
+    </w:p>
+    <w:p>
+      <w:pPr>
+        <w:spacing w:line="360"/>
+        <w:ind w:firstLine="709"/>
+        <w:jc w:val="left"/>
+      </w:pPr>
+      <w:r>
+        <w:rPr>
+          <w:rFonts w:ascii="Arial" w:cs="Arial" w:eastAsia="Arial" w:hAnsi="Arial"/>
+          <w:b w:val="false"/>
+          <w:bCs w:val="false"/>
+          <w:i w:val="false"/>
+          <w:iCs w:val="false"/>
+          <w:sz w:val="24"/>
+          <w:szCs w:val="24"/>
+        </w:rPr>
+        <w:t xml:space="preserve">Oracle se reserva el derecho de recuperar las instancias Always Free que considera ociosas: aquellas que durante 7 días mantienen a la vez un uso de CPU inferior al 20 % (percentil 95), un uso de red inferior al 20 % y, en las instancias A1, un uso de memoria inferior al 20 % (Oracle, s. f.-a). Un honeypot de media interacción cumple las tres condiciones, ya que Cowrie consume muy pocos recursos, por lo que la instancia corría el riesgo de ser recuperada en mitad del periodo de captura.</w:t>
+      </w:r>
+    </w:p>
+    <w:p>
+      <w:pPr>
+        <w:spacing w:line="360"/>
+        <w:ind w:firstLine="709"/>
+        <w:jc w:val="left"/>
+      </w:pPr>
+      <w:r>
+        <w:rPr>
+          <w:rFonts w:ascii="Arial" w:cs="Arial" w:eastAsia="Arial" w:hAnsi="Arial"/>
+          <w:b w:val="false"/>
+          <w:bCs w:val="false"/>
+          <w:i w:val="false"/>
+          <w:iCs w:val="false"/>
+          <w:sz w:val="24"/>
+          <w:szCs w:val="24"/>
+        </w:rPr>
+        <w:t xml:space="preserve">Dado que las tres condiciones deben cumplirse simultáneamente, basta con evitar una de ellas. Se desarrolló un pequeño servicio, oci-keepalive, que reserva el 25 % de la memoria RAM y la mantiene ocupada sin consumir CPU. El servicio se ejecuta con un usuario efímero sin privilegios, sin acceso a la red ni al sistema de ficheros, y con el uso de swap deshabilitado para garantizar que la reserva permanezca en memoria física. Se descartó la alternativa de generar carga de CPU artificial por ser un consumo innecesario de recursos compartidos.</w:t>
+      </w:r>
+    </w:p>
+    <w:p>
+      <w:pPr>
         <w:pStyle w:val="Heading2"/>
         <w:spacing w:after="240" w:before="240" w:line="360"/>
         <w:jc w:val="left"/>
@@ -16662,6 +16757,38 @@
           <w:szCs w:val="24"/>
         </w:rPr>
         <w:t xml:space="preserve">Oracle Corporation. (s. f.). Oracle Cloud Free Tier. https://www.oracle.com/cloud/free/</w:t>
+      </w:r>
+    </w:p>
+    <w:p>
+      <w:pPr>
+        <w:spacing w:line="360"/>
+        <w:jc w:val="left"/>
+      </w:pPr>
+      <w:r>
+        <w:rPr>
+          <w:rFonts w:ascii="Arial" w:cs="Arial" w:eastAsia="Arial" w:hAnsi="Arial"/>
+          <w:b w:val="false"/>
+          <w:bCs w:val="false"/>
+          <w:i/>
+          <w:iCs/>
+          <w:sz w:val="24"/>
+          <w:szCs w:val="24"/>
+        </w:rPr>
+        <w:t xml:space="preserve">Límites del tier Always Free y política de recuperación de instancias ociosas.</w:t>
+      </w:r>
+    </w:p>
+    <w:p>
+      <w:pPr>
+        <w:spacing w:after="200" w:line="360"/>
+        <w:ind w:left="709" w:hanging="709"/>
+      </w:pPr>
+      <w:r>
+        <w:rPr>
+          <w:rFonts w:ascii="Arial" w:cs="Arial" w:eastAsia="Arial" w:hAnsi="Arial"/>
+          <w:sz w:val="24"/>
+          <w:szCs w:val="24"/>
+        </w:rPr>
+        <w:t xml:space="preserve">Oracle. (s. f.-a). Always Free resources. Oracle Cloud Infrastructure Documentation. https://docs.oracle.com/en-us/iaas/Content/FreeTier/freetier_topic-Always_Free_Resources.htm</w:t>
       </w:r>
     </w:p>
     <w:p>

</xml_diff>

<commit_message>
Clasificación automática MITRE ATT&CK en el analizador, con pruebas
</commit_message>
<xml_diff>
--- a/docs/Memoria_PIASIR_Diego_Perez_Fonterosa.docx
+++ b/docs/Memoria_PIASIR_Diego_Perez_Fonterosa.docx
@@ -14847,7 +14847,7 @@
           <w:sz w:val="24"/>
           <w:szCs w:val="24"/>
         </w:rPr>
-        <w:t xml:space="preserve">Mapeo MITRE ATT&amp;CK Esperado</w:t>
+        <w:t xml:space="preserve">Catálogo de Técnicas MITRE ATT&amp;CK</w:t>
       </w:r>
     </w:p>
     <w:p>
@@ -14866,7 +14866,7 @@
           <w:sz w:val="24"/>
           <w:szCs w:val="24"/>
         </w:rPr>
-        <w:t xml:space="preserve">A partir de la literatura y de los datos simulados, se anticipa que los ataques capturados se mapearán a las siguientes técnicas del marco MITRE ATT&amp;CK:</w:t>
+        <w:t xml:space="preserve">La clasificación de la actividad se automatiza con el módulo mitre_mapping.py, descrito en el capítulo de Implementación. La tabla siguiente recoge su catálogo de reglas: las técnicas que el clasificador es capaz de reconocer y los indicadores que busca en los logs de Cowrie. Los identificadores se han comprobado contra la web oficial de MITRE ATT&amp;CK.</w:t>
       </w:r>
     </w:p>
     <w:tbl>
@@ -14882,15 +14882,18 @@
         </w:tblBorders>
       </w:tblPr>
       <w:tblGrid>
-        <w:gridCol w:w="1588"/>
-        <w:gridCol w:w="2381"/>
-        <w:gridCol w:w="953"/>
-        <w:gridCol w:w="3016"/>
+        <w:gridCol w:w="1349"/>
+        <w:gridCol w:w="2699"/>
+        <w:gridCol w:w="1270"/>
+        <w:gridCol w:w="2620"/>
       </w:tblGrid>
       <w:tr>
-        <w:tc>
-          <w:tcPr>
-            <w:tcW w:type="pct" w:w="1000"/>
+        <w:trPr>
+          <w:tblHeader/>
+        </w:trPr>
+        <w:tc>
+          <w:tcPr>
+            <w:tcW w:type="pct" w:w="850"/>
             <w:shd w:fill="D9E2F3" w:color="D9E2F3" w:val="solid"/>
             <w:vAlign w:val="center"/>
           </w:tcPr>
@@ -14913,7 +14916,7 @@
         </w:tc>
         <w:tc>
           <w:tcPr>
-            <w:tcW w:type="pct" w:w="1500"/>
+            <w:tcW w:type="pct" w:w="1700"/>
             <w:shd w:fill="D9E2F3" w:color="D9E2F3" w:val="solid"/>
             <w:vAlign w:val="center"/>
           </w:tcPr>
@@ -14936,14 +14939,14 @@
         </w:tc>
         <w:tc>
           <w:tcPr>
-            <w:tcW w:type="pct" w:w="600"/>
+            <w:tcW w:type="pct" w:w="800"/>
             <w:shd w:fill="D9E2F3" w:color="D9E2F3" w:val="solid"/>
             <w:vAlign w:val="center"/>
           </w:tcPr>
           <w:p>
             <w:pPr>
               <w:spacing w:line="276"/>
-              <w:jc w:val="center"/>
+              <w:jc w:val="left"/>
             </w:pPr>
             <w:r>
               <w:rPr>
@@ -14959,7 +14962,7 @@
         </w:tc>
         <w:tc>
           <w:tcPr>
-            <w:tcW w:type="pct" w:w="1900"/>
+            <w:tcW w:type="pct" w:w="1650"/>
             <w:shd w:fill="D9E2F3" w:color="D9E2F3" w:val="solid"/>
             <w:vAlign w:val="center"/>
           </w:tcPr>
@@ -14976,7 +14979,7 @@
                 <w:sz w:val="20"/>
                 <w:szCs w:val="20"/>
               </w:rPr>
-              <w:t xml:space="preserve">Evidencia esperada</w:t>
+              <w:t xml:space="preserve">Indicadores en los logs</w:t>
             </w:r>
           </w:p>
         </w:tc>
@@ -14984,6 +14987,7 @@
       <w:tr>
         <w:tc>
           <w:tcPr>
+            <w:tcW w:type="pct" w:w="850"/>
             <w:vAlign w:val="center"/>
           </w:tcPr>
           <w:p>
@@ -15005,64 +15009,67 @@
         </w:tc>
         <w:tc>
           <w:tcPr>
-            <w:vAlign w:val="center"/>
-          </w:tcPr>
-          <w:p>
-            <w:pPr>
-              <w:spacing w:line="276"/>
-              <w:jc w:val="left"/>
-            </w:pPr>
-            <w:r>
-              <w:rPr>
-                <w:rFonts w:ascii="Arial" w:cs="Arial" w:eastAsia="Arial" w:hAnsi="Arial"/>
-                <w:b w:val="false"/>
-                <w:bCs w:val="false"/>
-                <w:sz w:val="20"/>
-                <w:szCs w:val="20"/>
-              </w:rPr>
-              <w:t xml:space="preserve">Brute Force: Password Guessing</w:t>
-            </w:r>
-          </w:p>
-        </w:tc>
-        <w:tc>
-          <w:tcPr>
-            <w:vAlign w:val="center"/>
-          </w:tcPr>
-          <w:p>
-            <w:pPr>
-              <w:spacing w:line="276"/>
-              <w:jc w:val="center"/>
-            </w:pPr>
-            <w:r>
-              <w:rPr>
-                <w:rFonts w:ascii="Arial" w:cs="Arial" w:eastAsia="Arial" w:hAnsi="Arial"/>
-                <w:b w:val="false"/>
-                <w:bCs w:val="false"/>
-                <w:sz w:val="20"/>
-                <w:szCs w:val="20"/>
-              </w:rPr>
-              <w:t xml:space="preserve">T1110.001</w:t>
-            </w:r>
-          </w:p>
-        </w:tc>
-        <w:tc>
-          <w:tcPr>
-            <w:vAlign w:val="center"/>
-          </w:tcPr>
-          <w:p>
-            <w:pPr>
-              <w:spacing w:line="276"/>
-              <w:jc w:val="left"/>
-            </w:pPr>
-            <w:r>
-              <w:rPr>
-                <w:rFonts w:ascii="Arial" w:cs="Arial" w:eastAsia="Arial" w:hAnsi="Arial"/>
-                <w:b w:val="false"/>
-                <w:bCs w:val="false"/>
-                <w:sz w:val="20"/>
-                <w:szCs w:val="20"/>
-              </w:rPr>
-              <w:t xml:space="preserve">Eventos cowrie.login.failed masivos</w:t>
+            <w:tcW w:type="pct" w:w="1700"/>
+            <w:vAlign w:val="center"/>
+          </w:tcPr>
+          <w:p>
+            <w:pPr>
+              <w:spacing w:line="276"/>
+              <w:jc w:val="left"/>
+            </w:pPr>
+            <w:r>
+              <w:rPr>
+                <w:rFonts w:ascii="Arial" w:cs="Arial" w:eastAsia="Arial" w:hAnsi="Arial"/>
+                <w:b w:val="false"/>
+                <w:bCs w:val="false"/>
+                <w:sz w:val="20"/>
+                <w:szCs w:val="20"/>
+              </w:rPr>
+              <w:t xml:space="preserve">Valid Accounts: Local Accounts</w:t>
+            </w:r>
+          </w:p>
+        </w:tc>
+        <w:tc>
+          <w:tcPr>
+            <w:tcW w:type="pct" w:w="800"/>
+            <w:vAlign w:val="center"/>
+          </w:tcPr>
+          <w:p>
+            <w:pPr>
+              <w:spacing w:line="276"/>
+              <w:jc w:val="left"/>
+            </w:pPr>
+            <w:r>
+              <w:rPr>
+                <w:rFonts w:ascii="Arial" w:cs="Arial" w:eastAsia="Arial" w:hAnsi="Arial"/>
+                <w:b w:val="false"/>
+                <w:bCs w:val="false"/>
+                <w:sz w:val="20"/>
+                <w:szCs w:val="20"/>
+              </w:rPr>
+              <w:t xml:space="preserve">T1078.003</w:t>
+            </w:r>
+          </w:p>
+        </w:tc>
+        <w:tc>
+          <w:tcPr>
+            <w:tcW w:type="pct" w:w="1650"/>
+            <w:vAlign w:val="center"/>
+          </w:tcPr>
+          <w:p>
+            <w:pPr>
+              <w:spacing w:line="276"/>
+              <w:jc w:val="left"/>
+            </w:pPr>
+            <w:r>
+              <w:rPr>
+                <w:rFonts w:ascii="Arial" w:cs="Arial" w:eastAsia="Arial" w:hAnsi="Arial"/>
+                <w:b w:val="false"/>
+                <w:bCs w:val="false"/>
+                <w:sz w:val="20"/>
+                <w:szCs w:val="20"/>
+              </w:rPr>
+              <w:t xml:space="preserve">Evento cowrie.login.success</w:t>
             </w:r>
           </w:p>
         </w:tc>
@@ -15070,85 +15077,89 @@
       <w:tr>
         <w:tc>
           <w:tcPr>
-            <w:vAlign w:val="center"/>
-          </w:tcPr>
-          <w:p>
-            <w:pPr>
-              <w:spacing w:line="276"/>
-              <w:jc w:val="left"/>
-            </w:pPr>
-            <w:r>
-              <w:rPr>
-                <w:rFonts w:ascii="Arial" w:cs="Arial" w:eastAsia="Arial" w:hAnsi="Arial"/>
-                <w:b w:val="false"/>
-                <w:bCs w:val="false"/>
-                <w:sz w:val="20"/>
-                <w:szCs w:val="20"/>
-              </w:rPr>
-              <w:t xml:space="preserve">Initial Access</w:t>
-            </w:r>
-          </w:p>
-        </w:tc>
-        <w:tc>
-          <w:tcPr>
-            <w:vAlign w:val="center"/>
-          </w:tcPr>
-          <w:p>
-            <w:pPr>
-              <w:spacing w:line="276"/>
-              <w:jc w:val="left"/>
-            </w:pPr>
-            <w:r>
-              <w:rPr>
-                <w:rFonts w:ascii="Arial" w:cs="Arial" w:eastAsia="Arial" w:hAnsi="Arial"/>
-                <w:b w:val="false"/>
-                <w:bCs w:val="false"/>
-                <w:sz w:val="20"/>
-                <w:szCs w:val="20"/>
-              </w:rPr>
-              <w:t xml:space="preserve">Valid Accounts: Default Accounts</w:t>
-            </w:r>
-          </w:p>
-        </w:tc>
-        <w:tc>
-          <w:tcPr>
-            <w:vAlign w:val="center"/>
-          </w:tcPr>
-          <w:p>
-            <w:pPr>
-              <w:spacing w:line="276"/>
-              <w:jc w:val="center"/>
-            </w:pPr>
-            <w:r>
-              <w:rPr>
-                <w:rFonts w:ascii="Arial" w:cs="Arial" w:eastAsia="Arial" w:hAnsi="Arial"/>
-                <w:b w:val="false"/>
-                <w:bCs w:val="false"/>
-                <w:sz w:val="20"/>
-                <w:szCs w:val="20"/>
-              </w:rPr>
-              <w:t xml:space="preserve">T1078.001</w:t>
-            </w:r>
-          </w:p>
-        </w:tc>
-        <w:tc>
-          <w:tcPr>
-            <w:vAlign w:val="center"/>
-          </w:tcPr>
-          <w:p>
-            <w:pPr>
-              <w:spacing w:line="276"/>
-              <w:jc w:val="left"/>
-            </w:pPr>
-            <w:r>
-              <w:rPr>
-                <w:rFonts w:ascii="Arial" w:cs="Arial" w:eastAsia="Arial" w:hAnsi="Arial"/>
-                <w:b w:val="false"/>
-                <w:bCs w:val="false"/>
-                <w:sz w:val="20"/>
-                <w:szCs w:val="20"/>
-              </w:rPr>
-              <w:t xml:space="preserve">Logins con root/admin y passwords triviales</w:t>
+            <w:tcW w:type="pct" w:w="850"/>
+            <w:vAlign w:val="center"/>
+          </w:tcPr>
+          <w:p>
+            <w:pPr>
+              <w:spacing w:line="276"/>
+              <w:jc w:val="left"/>
+            </w:pPr>
+            <w:r>
+              <w:rPr>
+                <w:rFonts w:ascii="Arial" w:cs="Arial" w:eastAsia="Arial" w:hAnsi="Arial"/>
+                <w:b w:val="false"/>
+                <w:bCs w:val="false"/>
+                <w:sz w:val="20"/>
+                <w:szCs w:val="20"/>
+              </w:rPr>
+              <w:t xml:space="preserve">Execution</w:t>
+            </w:r>
+          </w:p>
+        </w:tc>
+        <w:tc>
+          <w:tcPr>
+            <w:tcW w:type="pct" w:w="1700"/>
+            <w:vAlign w:val="center"/>
+          </w:tcPr>
+          <w:p>
+            <w:pPr>
+              <w:spacing w:line="276"/>
+              <w:jc w:val="left"/>
+            </w:pPr>
+            <w:r>
+              <w:rPr>
+                <w:rFonts w:ascii="Arial" w:cs="Arial" w:eastAsia="Arial" w:hAnsi="Arial"/>
+                <w:b w:val="false"/>
+                <w:bCs w:val="false"/>
+                <w:sz w:val="20"/>
+                <w:szCs w:val="20"/>
+              </w:rPr>
+              <w:t xml:space="preserve">Command and Scripting Interpreter: Unix Shell</w:t>
+            </w:r>
+          </w:p>
+        </w:tc>
+        <w:tc>
+          <w:tcPr>
+            <w:tcW w:type="pct" w:w="800"/>
+            <w:vAlign w:val="center"/>
+          </w:tcPr>
+          <w:p>
+            <w:pPr>
+              <w:spacing w:line="276"/>
+              <w:jc w:val="left"/>
+            </w:pPr>
+            <w:r>
+              <w:rPr>
+                <w:rFonts w:ascii="Arial" w:cs="Arial" w:eastAsia="Arial" w:hAnsi="Arial"/>
+                <w:b w:val="false"/>
+                <w:bCs w:val="false"/>
+                <w:sz w:val="20"/>
+                <w:szCs w:val="20"/>
+              </w:rPr>
+              <w:t xml:space="preserve">T1059.004</w:t>
+            </w:r>
+          </w:p>
+        </w:tc>
+        <w:tc>
+          <w:tcPr>
+            <w:tcW w:type="pct" w:w="1650"/>
+            <w:vAlign w:val="center"/>
+          </w:tcPr>
+          <w:p>
+            <w:pPr>
+              <w:spacing w:line="276"/>
+              <w:jc w:val="left"/>
+            </w:pPr>
+            <w:r>
+              <w:rPr>
+                <w:rFonts w:ascii="Arial" w:cs="Arial" w:eastAsia="Arial" w:hAnsi="Arial"/>
+                <w:b w:val="false"/>
+                <w:bCs w:val="false"/>
+                <w:sz w:val="20"/>
+                <w:szCs w:val="20"/>
+              </w:rPr>
+              <w:t xml:space="preserve">Cualquier evento cowrie.command.input</w:t>
             </w:r>
           </w:p>
         </w:tc>
@@ -15156,85 +15167,89 @@
       <w:tr>
         <w:tc>
           <w:tcPr>
-            <w:vAlign w:val="center"/>
-          </w:tcPr>
-          <w:p>
-            <w:pPr>
-              <w:spacing w:line="276"/>
-              <w:jc w:val="left"/>
-            </w:pPr>
-            <w:r>
-              <w:rPr>
-                <w:rFonts w:ascii="Arial" w:cs="Arial" w:eastAsia="Arial" w:hAnsi="Arial"/>
-                <w:b w:val="false"/>
-                <w:bCs w:val="false"/>
-                <w:sz w:val="20"/>
-                <w:szCs w:val="20"/>
-              </w:rPr>
-              <w:t xml:space="preserve">Execution</w:t>
-            </w:r>
-          </w:p>
-        </w:tc>
-        <w:tc>
-          <w:tcPr>
-            <w:vAlign w:val="center"/>
-          </w:tcPr>
-          <w:p>
-            <w:pPr>
-              <w:spacing w:line="276"/>
-              <w:jc w:val="left"/>
-            </w:pPr>
-            <w:r>
-              <w:rPr>
-                <w:rFonts w:ascii="Arial" w:cs="Arial" w:eastAsia="Arial" w:hAnsi="Arial"/>
-                <w:b w:val="false"/>
-                <w:bCs w:val="false"/>
-                <w:sz w:val="20"/>
-                <w:szCs w:val="20"/>
-              </w:rPr>
-              <w:t xml:space="preserve">Command and Scripting Interpreter: Unix Shell</w:t>
-            </w:r>
-          </w:p>
-        </w:tc>
-        <w:tc>
-          <w:tcPr>
-            <w:vAlign w:val="center"/>
-          </w:tcPr>
-          <w:p>
-            <w:pPr>
-              <w:spacing w:line="276"/>
-              <w:jc w:val="center"/>
-            </w:pPr>
-            <w:r>
-              <w:rPr>
-                <w:rFonts w:ascii="Arial" w:cs="Arial" w:eastAsia="Arial" w:hAnsi="Arial"/>
-                <w:b w:val="false"/>
-                <w:bCs w:val="false"/>
-                <w:sz w:val="20"/>
-                <w:szCs w:val="20"/>
-              </w:rPr>
-              <w:t xml:space="preserve">T1059.004</w:t>
-            </w:r>
-          </w:p>
-        </w:tc>
-        <w:tc>
-          <w:tcPr>
-            <w:vAlign w:val="center"/>
-          </w:tcPr>
-          <w:p>
-            <w:pPr>
-              <w:spacing w:line="276"/>
-              <w:jc w:val="left"/>
-            </w:pPr>
-            <w:r>
-              <w:rPr>
-                <w:rFonts w:ascii="Arial" w:cs="Arial" w:eastAsia="Arial" w:hAnsi="Arial"/>
-                <w:b w:val="false"/>
-                <w:bCs w:val="false"/>
-                <w:sz w:val="20"/>
-                <w:szCs w:val="20"/>
-              </w:rPr>
-              <w:t xml:space="preserve">Eventos cowrie.command.input</w:t>
+            <w:tcW w:type="pct" w:w="850"/>
+            <w:vAlign w:val="center"/>
+          </w:tcPr>
+          <w:p>
+            <w:pPr>
+              <w:spacing w:line="276"/>
+              <w:jc w:val="left"/>
+            </w:pPr>
+            <w:r>
+              <w:rPr>
+                <w:rFonts w:ascii="Arial" w:cs="Arial" w:eastAsia="Arial" w:hAnsi="Arial"/>
+                <w:b w:val="false"/>
+                <w:bCs w:val="false"/>
+                <w:sz w:val="20"/>
+                <w:szCs w:val="20"/>
+              </w:rPr>
+              <w:t xml:space="preserve">Persistence</w:t>
+            </w:r>
+          </w:p>
+        </w:tc>
+        <w:tc>
+          <w:tcPr>
+            <w:tcW w:type="pct" w:w="1700"/>
+            <w:vAlign w:val="center"/>
+          </w:tcPr>
+          <w:p>
+            <w:pPr>
+              <w:spacing w:line="276"/>
+              <w:jc w:val="left"/>
+            </w:pPr>
+            <w:r>
+              <w:rPr>
+                <w:rFonts w:ascii="Arial" w:cs="Arial" w:eastAsia="Arial" w:hAnsi="Arial"/>
+                <w:b w:val="false"/>
+                <w:bCs w:val="false"/>
+                <w:sz w:val="20"/>
+                <w:szCs w:val="20"/>
+              </w:rPr>
+              <w:t xml:space="preserve">Account Manipulation: SSH Authorized Keys</w:t>
+            </w:r>
+          </w:p>
+        </w:tc>
+        <w:tc>
+          <w:tcPr>
+            <w:tcW w:type="pct" w:w="800"/>
+            <w:vAlign w:val="center"/>
+          </w:tcPr>
+          <w:p>
+            <w:pPr>
+              <w:spacing w:line="276"/>
+              <w:jc w:val="left"/>
+            </w:pPr>
+            <w:r>
+              <w:rPr>
+                <w:rFonts w:ascii="Arial" w:cs="Arial" w:eastAsia="Arial" w:hAnsi="Arial"/>
+                <w:b w:val="false"/>
+                <w:bCs w:val="false"/>
+                <w:sz w:val="20"/>
+                <w:szCs w:val="20"/>
+              </w:rPr>
+              <w:t xml:space="preserve">T1098.004</w:t>
+            </w:r>
+          </w:p>
+        </w:tc>
+        <w:tc>
+          <w:tcPr>
+            <w:tcW w:type="pct" w:w="1650"/>
+            <w:vAlign w:val="center"/>
+          </w:tcPr>
+          <w:p>
+            <w:pPr>
+              <w:spacing w:line="276"/>
+              <w:jc w:val="left"/>
+            </w:pPr>
+            <w:r>
+              <w:rPr>
+                <w:rFonts w:ascii="Arial" w:cs="Arial" w:eastAsia="Arial" w:hAnsi="Arial"/>
+                <w:b w:val="false"/>
+                <w:bCs w:val="false"/>
+                <w:sz w:val="20"/>
+                <w:szCs w:val="20"/>
+              </w:rPr>
+              <w:t xml:space="preserve">Escritura en authorized_keys</w:t>
             </w:r>
           </w:p>
         </w:tc>
@@ -15242,85 +15257,89 @@
       <w:tr>
         <w:tc>
           <w:tcPr>
-            <w:vAlign w:val="center"/>
-          </w:tcPr>
-          <w:p>
-            <w:pPr>
-              <w:spacing w:line="276"/>
-              <w:jc w:val="left"/>
-            </w:pPr>
-            <w:r>
-              <w:rPr>
-                <w:rFonts w:ascii="Arial" w:cs="Arial" w:eastAsia="Arial" w:hAnsi="Arial"/>
-                <w:b w:val="false"/>
-                <w:bCs w:val="false"/>
-                <w:sz w:val="20"/>
-                <w:szCs w:val="20"/>
-              </w:rPr>
-              <w:t xml:space="preserve">Discovery</w:t>
-            </w:r>
-          </w:p>
-        </w:tc>
-        <w:tc>
-          <w:tcPr>
-            <w:vAlign w:val="center"/>
-          </w:tcPr>
-          <w:p>
-            <w:pPr>
-              <w:spacing w:line="276"/>
-              <w:jc w:val="left"/>
-            </w:pPr>
-            <w:r>
-              <w:rPr>
-                <w:rFonts w:ascii="Arial" w:cs="Arial" w:eastAsia="Arial" w:hAnsi="Arial"/>
-                <w:b w:val="false"/>
-                <w:bCs w:val="false"/>
-                <w:sz w:val="20"/>
-                <w:szCs w:val="20"/>
-              </w:rPr>
-              <w:t xml:space="preserve">System Information Discovery</w:t>
-            </w:r>
-          </w:p>
-        </w:tc>
-        <w:tc>
-          <w:tcPr>
-            <w:vAlign w:val="center"/>
-          </w:tcPr>
-          <w:p>
-            <w:pPr>
-              <w:spacing w:line="276"/>
-              <w:jc w:val="center"/>
-            </w:pPr>
-            <w:r>
-              <w:rPr>
-                <w:rFonts w:ascii="Arial" w:cs="Arial" w:eastAsia="Arial" w:hAnsi="Arial"/>
-                <w:b w:val="false"/>
-                <w:bCs w:val="false"/>
-                <w:sz w:val="20"/>
-                <w:szCs w:val="20"/>
-              </w:rPr>
-              <w:t xml:space="preserve">T1082</w:t>
-            </w:r>
-          </w:p>
-        </w:tc>
-        <w:tc>
-          <w:tcPr>
-            <w:vAlign w:val="center"/>
-          </w:tcPr>
-          <w:p>
-            <w:pPr>
-              <w:spacing w:line="276"/>
-              <w:jc w:val="left"/>
-            </w:pPr>
-            <w:r>
-              <w:rPr>
-                <w:rFonts w:ascii="Arial" w:cs="Arial" w:eastAsia="Arial" w:hAnsi="Arial"/>
-                <w:b w:val="false"/>
-                <w:bCs w:val="false"/>
-                <w:sz w:val="20"/>
-                <w:szCs w:val="20"/>
-              </w:rPr>
-              <w:t xml:space="preserve">Comandos uname -a, cat /proc/cpuinfo</w:t>
+            <w:tcW w:type="pct" w:w="850"/>
+            <w:vAlign w:val="center"/>
+          </w:tcPr>
+          <w:p>
+            <w:pPr>
+              <w:spacing w:line="276"/>
+              <w:jc w:val="left"/>
+            </w:pPr>
+            <w:r>
+              <w:rPr>
+                <w:rFonts w:ascii="Arial" w:cs="Arial" w:eastAsia="Arial" w:hAnsi="Arial"/>
+                <w:b w:val="false"/>
+                <w:bCs w:val="false"/>
+                <w:sz w:val="20"/>
+                <w:szCs w:val="20"/>
+              </w:rPr>
+              <w:t xml:space="preserve">Persistence</w:t>
+            </w:r>
+          </w:p>
+        </w:tc>
+        <w:tc>
+          <w:tcPr>
+            <w:tcW w:type="pct" w:w="1700"/>
+            <w:vAlign w:val="center"/>
+          </w:tcPr>
+          <w:p>
+            <w:pPr>
+              <w:spacing w:line="276"/>
+              <w:jc w:val="left"/>
+            </w:pPr>
+            <w:r>
+              <w:rPr>
+                <w:rFonts w:ascii="Arial" w:cs="Arial" w:eastAsia="Arial" w:hAnsi="Arial"/>
+                <w:b w:val="false"/>
+                <w:bCs w:val="false"/>
+                <w:sz w:val="20"/>
+                <w:szCs w:val="20"/>
+              </w:rPr>
+              <w:t xml:space="preserve">Account Manipulation</w:t>
+            </w:r>
+          </w:p>
+        </w:tc>
+        <w:tc>
+          <w:tcPr>
+            <w:tcW w:type="pct" w:w="800"/>
+            <w:vAlign w:val="center"/>
+          </w:tcPr>
+          <w:p>
+            <w:pPr>
+              <w:spacing w:line="276"/>
+              <w:jc w:val="left"/>
+            </w:pPr>
+            <w:r>
+              <w:rPr>
+                <w:rFonts w:ascii="Arial" w:cs="Arial" w:eastAsia="Arial" w:hAnsi="Arial"/>
+                <w:b w:val="false"/>
+                <w:bCs w:val="false"/>
+                <w:sz w:val="20"/>
+                <w:szCs w:val="20"/>
+              </w:rPr>
+              <w:t xml:space="preserve">T1098</w:t>
+            </w:r>
+          </w:p>
+        </w:tc>
+        <w:tc>
+          <w:tcPr>
+            <w:tcW w:type="pct" w:w="1650"/>
+            <w:vAlign w:val="center"/>
+          </w:tcPr>
+          <w:p>
+            <w:pPr>
+              <w:spacing w:line="276"/>
+              <w:jc w:val="left"/>
+            </w:pPr>
+            <w:r>
+              <w:rPr>
+                <w:rFonts w:ascii="Arial" w:cs="Arial" w:eastAsia="Arial" w:hAnsi="Arial"/>
+                <w:b w:val="false"/>
+                <w:bCs w:val="false"/>
+                <w:sz w:val="20"/>
+                <w:szCs w:val="20"/>
+              </w:rPr>
+              <w:t xml:space="preserve">chpasswd, passwd, usermod</w:t>
             </w:r>
           </w:p>
         </w:tc>
@@ -15328,85 +15347,89 @@
       <w:tr>
         <w:tc>
           <w:tcPr>
-            <w:vAlign w:val="center"/>
-          </w:tcPr>
-          <w:p>
-            <w:pPr>
-              <w:spacing w:line="276"/>
-              <w:jc w:val="left"/>
-            </w:pPr>
-            <w:r>
-              <w:rPr>
-                <w:rFonts w:ascii="Arial" w:cs="Arial" w:eastAsia="Arial" w:hAnsi="Arial"/>
-                <w:b w:val="false"/>
-                <w:bCs w:val="false"/>
-                <w:sz w:val="20"/>
-                <w:szCs w:val="20"/>
-              </w:rPr>
-              <w:t xml:space="preserve">Discovery</w:t>
-            </w:r>
-          </w:p>
-        </w:tc>
-        <w:tc>
-          <w:tcPr>
-            <w:vAlign w:val="center"/>
-          </w:tcPr>
-          <w:p>
-            <w:pPr>
-              <w:spacing w:line="276"/>
-              <w:jc w:val="left"/>
-            </w:pPr>
-            <w:r>
-              <w:rPr>
-                <w:rFonts w:ascii="Arial" w:cs="Arial" w:eastAsia="Arial" w:hAnsi="Arial"/>
-                <w:b w:val="false"/>
-                <w:bCs w:val="false"/>
-                <w:sz w:val="20"/>
-                <w:szCs w:val="20"/>
-              </w:rPr>
-              <w:t xml:space="preserve">Account Discovery</w:t>
-            </w:r>
-          </w:p>
-        </w:tc>
-        <w:tc>
-          <w:tcPr>
-            <w:vAlign w:val="center"/>
-          </w:tcPr>
-          <w:p>
-            <w:pPr>
-              <w:spacing w:line="276"/>
-              <w:jc w:val="center"/>
-            </w:pPr>
-            <w:r>
-              <w:rPr>
-                <w:rFonts w:ascii="Arial" w:cs="Arial" w:eastAsia="Arial" w:hAnsi="Arial"/>
-                <w:b w:val="false"/>
-                <w:bCs w:val="false"/>
-                <w:sz w:val="20"/>
-                <w:szCs w:val="20"/>
-              </w:rPr>
-              <w:t xml:space="preserve">T1087</w:t>
-            </w:r>
-          </w:p>
-        </w:tc>
-        <w:tc>
-          <w:tcPr>
-            <w:vAlign w:val="center"/>
-          </w:tcPr>
-          <w:p>
-            <w:pPr>
-              <w:spacing w:line="276"/>
-              <w:jc w:val="left"/>
-            </w:pPr>
-            <w:r>
-              <w:rPr>
-                <w:rFonts w:ascii="Arial" w:cs="Arial" w:eastAsia="Arial" w:hAnsi="Arial"/>
-                <w:b w:val="false"/>
-                <w:bCs w:val="false"/>
-                <w:sz w:val="20"/>
-                <w:szCs w:val="20"/>
-              </w:rPr>
-              <w:t xml:space="preserve">Comandos cat /etc/passwd, whoami, id</w:t>
+            <w:tcW w:type="pct" w:w="850"/>
+            <w:vAlign w:val="center"/>
+          </w:tcPr>
+          <w:p>
+            <w:pPr>
+              <w:spacing w:line="276"/>
+              <w:jc w:val="left"/>
+            </w:pPr>
+            <w:r>
+              <w:rPr>
+                <w:rFonts w:ascii="Arial" w:cs="Arial" w:eastAsia="Arial" w:hAnsi="Arial"/>
+                <w:b w:val="false"/>
+                <w:bCs w:val="false"/>
+                <w:sz w:val="20"/>
+                <w:szCs w:val="20"/>
+              </w:rPr>
+              <w:t xml:space="preserve">Persistence</w:t>
+            </w:r>
+          </w:p>
+        </w:tc>
+        <w:tc>
+          <w:tcPr>
+            <w:tcW w:type="pct" w:w="1700"/>
+            <w:vAlign w:val="center"/>
+          </w:tcPr>
+          <w:p>
+            <w:pPr>
+              <w:spacing w:line="276"/>
+              <w:jc w:val="left"/>
+            </w:pPr>
+            <w:r>
+              <w:rPr>
+                <w:rFonts w:ascii="Arial" w:cs="Arial" w:eastAsia="Arial" w:hAnsi="Arial"/>
+                <w:b w:val="false"/>
+                <w:bCs w:val="false"/>
+                <w:sz w:val="20"/>
+                <w:szCs w:val="20"/>
+              </w:rPr>
+              <w:t xml:space="preserve">Create Account: Local Account</w:t>
+            </w:r>
+          </w:p>
+        </w:tc>
+        <w:tc>
+          <w:tcPr>
+            <w:tcW w:type="pct" w:w="800"/>
+            <w:vAlign w:val="center"/>
+          </w:tcPr>
+          <w:p>
+            <w:pPr>
+              <w:spacing w:line="276"/>
+              <w:jc w:val="left"/>
+            </w:pPr>
+            <w:r>
+              <w:rPr>
+                <w:rFonts w:ascii="Arial" w:cs="Arial" w:eastAsia="Arial" w:hAnsi="Arial"/>
+                <w:b w:val="false"/>
+                <w:bCs w:val="false"/>
+                <w:sz w:val="20"/>
+                <w:szCs w:val="20"/>
+              </w:rPr>
+              <w:t xml:space="preserve">T1136.001</w:t>
+            </w:r>
+          </w:p>
+        </w:tc>
+        <w:tc>
+          <w:tcPr>
+            <w:tcW w:type="pct" w:w="1650"/>
+            <w:vAlign w:val="center"/>
+          </w:tcPr>
+          <w:p>
+            <w:pPr>
+              <w:spacing w:line="276"/>
+              <w:jc w:val="left"/>
+            </w:pPr>
+            <w:r>
+              <w:rPr>
+                <w:rFonts w:ascii="Arial" w:cs="Arial" w:eastAsia="Arial" w:hAnsi="Arial"/>
+                <w:b w:val="false"/>
+                <w:bCs w:val="false"/>
+                <w:sz w:val="20"/>
+                <w:szCs w:val="20"/>
+              </w:rPr>
+              <w:t xml:space="preserve">useradd, adduser</w:t>
             </w:r>
           </w:p>
         </w:tc>
@@ -15414,85 +15437,89 @@
       <w:tr>
         <w:tc>
           <w:tcPr>
-            <w:vAlign w:val="center"/>
-          </w:tcPr>
-          <w:p>
-            <w:pPr>
-              <w:spacing w:line="276"/>
-              <w:jc w:val="left"/>
-            </w:pPr>
-            <w:r>
-              <w:rPr>
-                <w:rFonts w:ascii="Arial" w:cs="Arial" w:eastAsia="Arial" w:hAnsi="Arial"/>
-                <w:b w:val="false"/>
-                <w:bCs w:val="false"/>
-                <w:sz w:val="20"/>
-                <w:szCs w:val="20"/>
-              </w:rPr>
-              <w:t xml:space="preserve">Lateral Movement</w:t>
-            </w:r>
-          </w:p>
-        </w:tc>
-        <w:tc>
-          <w:tcPr>
-            <w:vAlign w:val="center"/>
-          </w:tcPr>
-          <w:p>
-            <w:pPr>
-              <w:spacing w:line="276"/>
-              <w:jc w:val="left"/>
-            </w:pPr>
-            <w:r>
-              <w:rPr>
-                <w:rFonts w:ascii="Arial" w:cs="Arial" w:eastAsia="Arial" w:hAnsi="Arial"/>
-                <w:b w:val="false"/>
-                <w:bCs w:val="false"/>
-                <w:sz w:val="20"/>
-                <w:szCs w:val="20"/>
-              </w:rPr>
-              <w:t xml:space="preserve">Remote Services: SSH</w:t>
-            </w:r>
-          </w:p>
-        </w:tc>
-        <w:tc>
-          <w:tcPr>
-            <w:vAlign w:val="center"/>
-          </w:tcPr>
-          <w:p>
-            <w:pPr>
-              <w:spacing w:line="276"/>
-              <w:jc w:val="center"/>
-            </w:pPr>
-            <w:r>
-              <w:rPr>
-                <w:rFonts w:ascii="Arial" w:cs="Arial" w:eastAsia="Arial" w:hAnsi="Arial"/>
-                <w:b w:val="false"/>
-                <w:bCs w:val="false"/>
-                <w:sz w:val="20"/>
-                <w:szCs w:val="20"/>
-              </w:rPr>
-              <w:t xml:space="preserve">T1021.004</w:t>
-            </w:r>
-          </w:p>
-        </w:tc>
-        <w:tc>
-          <w:tcPr>
-            <w:vAlign w:val="center"/>
-          </w:tcPr>
-          <w:p>
-            <w:pPr>
-              <w:spacing w:line="276"/>
-              <w:jc w:val="left"/>
-            </w:pPr>
-            <w:r>
-              <w:rPr>
-                <w:rFonts w:ascii="Arial" w:cs="Arial" w:eastAsia="Arial" w:hAnsi="Arial"/>
-                <w:b w:val="false"/>
-                <w:bCs w:val="false"/>
-                <w:sz w:val="20"/>
-                <w:szCs w:val="20"/>
-              </w:rPr>
-              <w:t xml:space="preserve">Sesiones SSH desde IPs comprometidas</w:t>
+            <w:tcW w:type="pct" w:w="850"/>
+            <w:vAlign w:val="center"/>
+          </w:tcPr>
+          <w:p>
+            <w:pPr>
+              <w:spacing w:line="276"/>
+              <w:jc w:val="left"/>
+            </w:pPr>
+            <w:r>
+              <w:rPr>
+                <w:rFonts w:ascii="Arial" w:cs="Arial" w:eastAsia="Arial" w:hAnsi="Arial"/>
+                <w:b w:val="false"/>
+                <w:bCs w:val="false"/>
+                <w:sz w:val="20"/>
+                <w:szCs w:val="20"/>
+              </w:rPr>
+              <w:t xml:space="preserve">Persistence</w:t>
+            </w:r>
+          </w:p>
+        </w:tc>
+        <w:tc>
+          <w:tcPr>
+            <w:tcW w:type="pct" w:w="1700"/>
+            <w:vAlign w:val="center"/>
+          </w:tcPr>
+          <w:p>
+            <w:pPr>
+              <w:spacing w:line="276"/>
+              <w:jc w:val="left"/>
+            </w:pPr>
+            <w:r>
+              <w:rPr>
+                <w:rFonts w:ascii="Arial" w:cs="Arial" w:eastAsia="Arial" w:hAnsi="Arial"/>
+                <w:b w:val="false"/>
+                <w:bCs w:val="false"/>
+                <w:sz w:val="20"/>
+                <w:szCs w:val="20"/>
+              </w:rPr>
+              <w:t xml:space="preserve">Scheduled Task/Job: Cron</w:t>
+            </w:r>
+          </w:p>
+        </w:tc>
+        <w:tc>
+          <w:tcPr>
+            <w:tcW w:type="pct" w:w="800"/>
+            <w:vAlign w:val="center"/>
+          </w:tcPr>
+          <w:p>
+            <w:pPr>
+              <w:spacing w:line="276"/>
+              <w:jc w:val="left"/>
+            </w:pPr>
+            <w:r>
+              <w:rPr>
+                <w:rFonts w:ascii="Arial" w:cs="Arial" w:eastAsia="Arial" w:hAnsi="Arial"/>
+                <w:b w:val="false"/>
+                <w:bCs w:val="false"/>
+                <w:sz w:val="20"/>
+                <w:szCs w:val="20"/>
+              </w:rPr>
+              <w:t xml:space="preserve">T1053.003</w:t>
+            </w:r>
+          </w:p>
+        </w:tc>
+        <w:tc>
+          <w:tcPr>
+            <w:tcW w:type="pct" w:w="1650"/>
+            <w:vAlign w:val="center"/>
+          </w:tcPr>
+          <w:p>
+            <w:pPr>
+              <w:spacing w:line="276"/>
+              <w:jc w:val="left"/>
+            </w:pPr>
+            <w:r>
+              <w:rPr>
+                <w:rFonts w:ascii="Arial" w:cs="Arial" w:eastAsia="Arial" w:hAnsi="Arial"/>
+                <w:b w:val="false"/>
+                <w:bCs w:val="false"/>
+                <w:sz w:val="20"/>
+                <w:szCs w:val="20"/>
+              </w:rPr>
+              <w:t xml:space="preserve">crontab -e, | crontab -, /etc/cron</w:t>
             </w:r>
           </w:p>
         </w:tc>
@@ -15500,85 +15527,89 @@
       <w:tr>
         <w:tc>
           <w:tcPr>
-            <w:vAlign w:val="center"/>
-          </w:tcPr>
-          <w:p>
-            <w:pPr>
-              <w:spacing w:line="276"/>
-              <w:jc w:val="left"/>
-            </w:pPr>
-            <w:r>
-              <w:rPr>
-                <w:rFonts w:ascii="Arial" w:cs="Arial" w:eastAsia="Arial" w:hAnsi="Arial"/>
-                <w:b w:val="false"/>
-                <w:bCs w:val="false"/>
-                <w:sz w:val="20"/>
-                <w:szCs w:val="20"/>
-              </w:rPr>
-              <w:t xml:space="preserve">Command &amp; Control</w:t>
-            </w:r>
-          </w:p>
-        </w:tc>
-        <w:tc>
-          <w:tcPr>
-            <w:vAlign w:val="center"/>
-          </w:tcPr>
-          <w:p>
-            <w:pPr>
-              <w:spacing w:line="276"/>
-              <w:jc w:val="left"/>
-            </w:pPr>
-            <w:r>
-              <w:rPr>
-                <w:rFonts w:ascii="Arial" w:cs="Arial" w:eastAsia="Arial" w:hAnsi="Arial"/>
-                <w:b w:val="false"/>
-                <w:bCs w:val="false"/>
-                <w:sz w:val="20"/>
-                <w:szCs w:val="20"/>
-              </w:rPr>
-              <w:t xml:space="preserve">Ingress Tool Transfer</w:t>
-            </w:r>
-          </w:p>
-        </w:tc>
-        <w:tc>
-          <w:tcPr>
-            <w:vAlign w:val="center"/>
-          </w:tcPr>
-          <w:p>
-            <w:pPr>
-              <w:spacing w:line="276"/>
-              <w:jc w:val="center"/>
-            </w:pPr>
-            <w:r>
-              <w:rPr>
-                <w:rFonts w:ascii="Arial" w:cs="Arial" w:eastAsia="Arial" w:hAnsi="Arial"/>
-                <w:b w:val="false"/>
-                <w:bCs w:val="false"/>
-                <w:sz w:val="20"/>
-                <w:szCs w:val="20"/>
-              </w:rPr>
-              <w:t xml:space="preserve">T1105</w:t>
-            </w:r>
-          </w:p>
-        </w:tc>
-        <w:tc>
-          <w:tcPr>
-            <w:vAlign w:val="center"/>
-          </w:tcPr>
-          <w:p>
-            <w:pPr>
-              <w:spacing w:line="276"/>
-              <w:jc w:val="left"/>
-            </w:pPr>
-            <w:r>
-              <w:rPr>
-                <w:rFonts w:ascii="Arial" w:cs="Arial" w:eastAsia="Arial" w:hAnsi="Arial"/>
-                <w:b w:val="false"/>
-                <w:bCs w:val="false"/>
-                <w:sz w:val="20"/>
-                <w:szCs w:val="20"/>
-              </w:rPr>
-              <w:t xml:space="preserve">Eventos cowrie.session.file_download</w:t>
+            <w:tcW w:type="pct" w:w="850"/>
+            <w:vAlign w:val="center"/>
+          </w:tcPr>
+          <w:p>
+            <w:pPr>
+              <w:spacing w:line="276"/>
+              <w:jc w:val="left"/>
+            </w:pPr>
+            <w:r>
+              <w:rPr>
+                <w:rFonts w:ascii="Arial" w:cs="Arial" w:eastAsia="Arial" w:hAnsi="Arial"/>
+                <w:b w:val="false"/>
+                <w:bCs w:val="false"/>
+                <w:sz w:val="20"/>
+                <w:szCs w:val="20"/>
+              </w:rPr>
+              <w:t xml:space="preserve">Defense Evasion</w:t>
+            </w:r>
+          </w:p>
+        </w:tc>
+        <w:tc>
+          <w:tcPr>
+            <w:tcW w:type="pct" w:w="1700"/>
+            <w:vAlign w:val="center"/>
+          </w:tcPr>
+          <w:p>
+            <w:pPr>
+              <w:spacing w:line="276"/>
+              <w:jc w:val="left"/>
+            </w:pPr>
+            <w:r>
+              <w:rPr>
+                <w:rFonts w:ascii="Arial" w:cs="Arial" w:eastAsia="Arial" w:hAnsi="Arial"/>
+                <w:b w:val="false"/>
+                <w:bCs w:val="false"/>
+                <w:sz w:val="20"/>
+                <w:szCs w:val="20"/>
+              </w:rPr>
+              <w:t xml:space="preserve">File and Directory Permissions Modification: Linux</w:t>
+            </w:r>
+          </w:p>
+        </w:tc>
+        <w:tc>
+          <w:tcPr>
+            <w:tcW w:type="pct" w:w="800"/>
+            <w:vAlign w:val="center"/>
+          </w:tcPr>
+          <w:p>
+            <w:pPr>
+              <w:spacing w:line="276"/>
+              <w:jc w:val="left"/>
+            </w:pPr>
+            <w:r>
+              <w:rPr>
+                <w:rFonts w:ascii="Arial" w:cs="Arial" w:eastAsia="Arial" w:hAnsi="Arial"/>
+                <w:b w:val="false"/>
+                <w:bCs w:val="false"/>
+                <w:sz w:val="20"/>
+                <w:szCs w:val="20"/>
+              </w:rPr>
+              <w:t xml:space="preserve">T1222.002</w:t>
+            </w:r>
+          </w:p>
+        </w:tc>
+        <w:tc>
+          <w:tcPr>
+            <w:tcW w:type="pct" w:w="1650"/>
+            <w:vAlign w:val="center"/>
+          </w:tcPr>
+          <w:p>
+            <w:pPr>
+              <w:spacing w:line="276"/>
+              <w:jc w:val="left"/>
+            </w:pPr>
+            <w:r>
+              <w:rPr>
+                <w:rFonts w:ascii="Arial" w:cs="Arial" w:eastAsia="Arial" w:hAnsi="Arial"/>
+                <w:b w:val="false"/>
+                <w:bCs w:val="false"/>
+                <w:sz w:val="20"/>
+                <w:szCs w:val="20"/>
+              </w:rPr>
+              <w:t xml:space="preserve">chmod, chattr, chown</w:t>
             </w:r>
           </w:p>
         </w:tc>
@@ -15586,6 +15617,7 @@
       <w:tr>
         <w:tc>
           <w:tcPr>
+            <w:tcW w:type="pct" w:w="850"/>
             <w:vAlign w:val="center"/>
           </w:tcPr>
           <w:p>
@@ -15607,64 +15639,67 @@
         </w:tc>
         <w:tc>
           <w:tcPr>
-            <w:vAlign w:val="center"/>
-          </w:tcPr>
-          <w:p>
-            <w:pPr>
-              <w:spacing w:line="276"/>
-              <w:jc w:val="left"/>
-            </w:pPr>
-            <w:r>
-              <w:rPr>
-                <w:rFonts w:ascii="Arial" w:cs="Arial" w:eastAsia="Arial" w:hAnsi="Arial"/>
-                <w:b w:val="false"/>
-                <w:bCs w:val="false"/>
-                <w:sz w:val="20"/>
-                <w:szCs w:val="20"/>
-              </w:rPr>
-              <w:t xml:space="preserve">Indicator Removal: Clear Linux Logs</w:t>
-            </w:r>
-          </w:p>
-        </w:tc>
-        <w:tc>
-          <w:tcPr>
-            <w:vAlign w:val="center"/>
-          </w:tcPr>
-          <w:p>
-            <w:pPr>
-              <w:spacing w:line="276"/>
-              <w:jc w:val="center"/>
-            </w:pPr>
-            <w:r>
-              <w:rPr>
-                <w:rFonts w:ascii="Arial" w:cs="Arial" w:eastAsia="Arial" w:hAnsi="Arial"/>
-                <w:b w:val="false"/>
-                <w:bCs w:val="false"/>
-                <w:sz w:val="20"/>
-                <w:szCs w:val="20"/>
-              </w:rPr>
-              <w:t xml:space="preserve">T1070.002</w:t>
-            </w:r>
-          </w:p>
-        </w:tc>
-        <w:tc>
-          <w:tcPr>
-            <w:vAlign w:val="center"/>
-          </w:tcPr>
-          <w:p>
-            <w:pPr>
-              <w:spacing w:line="276"/>
-              <w:jc w:val="left"/>
-            </w:pPr>
-            <w:r>
-              <w:rPr>
-                <w:rFonts w:ascii="Arial" w:cs="Arial" w:eastAsia="Arial" w:hAnsi="Arial"/>
-                <w:b w:val="false"/>
-                <w:bCs w:val="false"/>
-                <w:sz w:val="20"/>
-                <w:szCs w:val="20"/>
-              </w:rPr>
-              <w:t xml:space="preserve">Comandos rm /var/log/*, history -c</w:t>
+            <w:tcW w:type="pct" w:w="1700"/>
+            <w:vAlign w:val="center"/>
+          </w:tcPr>
+          <w:p>
+            <w:pPr>
+              <w:spacing w:line="276"/>
+              <w:jc w:val="left"/>
+            </w:pPr>
+            <w:r>
+              <w:rPr>
+                <w:rFonts w:ascii="Arial" w:cs="Arial" w:eastAsia="Arial" w:hAnsi="Arial"/>
+                <w:b w:val="false"/>
+                <w:bCs w:val="false"/>
+                <w:sz w:val="20"/>
+                <w:szCs w:val="20"/>
+              </w:rPr>
+              <w:t xml:space="preserve">Indicator Removal: Clear Command History</w:t>
+            </w:r>
+          </w:p>
+        </w:tc>
+        <w:tc>
+          <w:tcPr>
+            <w:tcW w:type="pct" w:w="800"/>
+            <w:vAlign w:val="center"/>
+          </w:tcPr>
+          <w:p>
+            <w:pPr>
+              <w:spacing w:line="276"/>
+              <w:jc w:val="left"/>
+            </w:pPr>
+            <w:r>
+              <w:rPr>
+                <w:rFonts w:ascii="Arial" w:cs="Arial" w:eastAsia="Arial" w:hAnsi="Arial"/>
+                <w:b w:val="false"/>
+                <w:bCs w:val="false"/>
+                <w:sz w:val="20"/>
+                <w:szCs w:val="20"/>
+              </w:rPr>
+              <w:t xml:space="preserve">T1070.003</w:t>
+            </w:r>
+          </w:p>
+        </w:tc>
+        <w:tc>
+          <w:tcPr>
+            <w:tcW w:type="pct" w:w="1650"/>
+            <w:vAlign w:val="center"/>
+          </w:tcPr>
+          <w:p>
+            <w:pPr>
+              <w:spacing w:line="276"/>
+              <w:jc w:val="left"/>
+            </w:pPr>
+            <w:r>
+              <w:rPr>
+                <w:rFonts w:ascii="Arial" w:cs="Arial" w:eastAsia="Arial" w:hAnsi="Arial"/>
+                <w:b w:val="false"/>
+                <w:bCs w:val="false"/>
+                <w:sz w:val="20"/>
+                <w:szCs w:val="20"/>
+              </w:rPr>
+              <w:t xml:space="preserve">history -c, unset HISTFILE</w:t>
             </w:r>
           </w:p>
         </w:tc>
@@ -15672,6 +15707,1177 @@
       <w:tr>
         <w:tc>
           <w:tcPr>
+            <w:tcW w:type="pct" w:w="850"/>
+            <w:vAlign w:val="center"/>
+          </w:tcPr>
+          <w:p>
+            <w:pPr>
+              <w:spacing w:line="276"/>
+              <w:jc w:val="left"/>
+            </w:pPr>
+            <w:r>
+              <w:rPr>
+                <w:rFonts w:ascii="Arial" w:cs="Arial" w:eastAsia="Arial" w:hAnsi="Arial"/>
+                <w:b w:val="false"/>
+                <w:bCs w:val="false"/>
+                <w:sz w:val="20"/>
+                <w:szCs w:val="20"/>
+              </w:rPr>
+              <w:t xml:space="preserve">Defense Evasion</w:t>
+            </w:r>
+          </w:p>
+        </w:tc>
+        <w:tc>
+          <w:tcPr>
+            <w:tcW w:type="pct" w:w="1700"/>
+            <w:vAlign w:val="center"/>
+          </w:tcPr>
+          <w:p>
+            <w:pPr>
+              <w:spacing w:line="276"/>
+              <w:jc w:val="left"/>
+            </w:pPr>
+            <w:r>
+              <w:rPr>
+                <w:rFonts w:ascii="Arial" w:cs="Arial" w:eastAsia="Arial" w:hAnsi="Arial"/>
+                <w:b w:val="false"/>
+                <w:bCs w:val="false"/>
+                <w:sz w:val="20"/>
+                <w:szCs w:val="20"/>
+              </w:rPr>
+              <w:t xml:space="preserve">Indicator Removal: Clear Linux or Mac System Logs</w:t>
+            </w:r>
+          </w:p>
+        </w:tc>
+        <w:tc>
+          <w:tcPr>
+            <w:tcW w:type="pct" w:w="800"/>
+            <w:vAlign w:val="center"/>
+          </w:tcPr>
+          <w:p>
+            <w:pPr>
+              <w:spacing w:line="276"/>
+              <w:jc w:val="left"/>
+            </w:pPr>
+            <w:r>
+              <w:rPr>
+                <w:rFonts w:ascii="Arial" w:cs="Arial" w:eastAsia="Arial" w:hAnsi="Arial"/>
+                <w:b w:val="false"/>
+                <w:bCs w:val="false"/>
+                <w:sz w:val="20"/>
+                <w:szCs w:val="20"/>
+              </w:rPr>
+              <w:t xml:space="preserve">T1070.002</w:t>
+            </w:r>
+          </w:p>
+        </w:tc>
+        <w:tc>
+          <w:tcPr>
+            <w:tcW w:type="pct" w:w="1650"/>
+            <w:vAlign w:val="center"/>
+          </w:tcPr>
+          <w:p>
+            <w:pPr>
+              <w:spacing w:line="276"/>
+              <w:jc w:val="left"/>
+            </w:pPr>
+            <w:r>
+              <w:rPr>
+                <w:rFonts w:ascii="Arial" w:cs="Arial" w:eastAsia="Arial" w:hAnsi="Arial"/>
+                <w:b w:val="false"/>
+                <w:bCs w:val="false"/>
+                <w:sz w:val="20"/>
+                <w:szCs w:val="20"/>
+              </w:rPr>
+              <w:t xml:space="preserve">rm de /var/log, wtmp, btmp</w:t>
+            </w:r>
+          </w:p>
+        </w:tc>
+      </w:tr>
+      <w:tr>
+        <w:tc>
+          <w:tcPr>
+            <w:tcW w:type="pct" w:w="850"/>
+            <w:vAlign w:val="center"/>
+          </w:tcPr>
+          <w:p>
+            <w:pPr>
+              <w:spacing w:line="276"/>
+              <w:jc w:val="left"/>
+            </w:pPr>
+            <w:r>
+              <w:rPr>
+                <w:rFonts w:ascii="Arial" w:cs="Arial" w:eastAsia="Arial" w:hAnsi="Arial"/>
+                <w:b w:val="false"/>
+                <w:bCs w:val="false"/>
+                <w:sz w:val="20"/>
+                <w:szCs w:val="20"/>
+              </w:rPr>
+              <w:t xml:space="preserve">Defense Evasion</w:t>
+            </w:r>
+          </w:p>
+        </w:tc>
+        <w:tc>
+          <w:tcPr>
+            <w:tcW w:type="pct" w:w="1700"/>
+            <w:vAlign w:val="center"/>
+          </w:tcPr>
+          <w:p>
+            <w:pPr>
+              <w:spacing w:line="276"/>
+              <w:jc w:val="left"/>
+            </w:pPr>
+            <w:r>
+              <w:rPr>
+                <w:rFonts w:ascii="Arial" w:cs="Arial" w:eastAsia="Arial" w:hAnsi="Arial"/>
+                <w:b w:val="false"/>
+                <w:bCs w:val="false"/>
+                <w:sz w:val="20"/>
+                <w:szCs w:val="20"/>
+              </w:rPr>
+              <w:t xml:space="preserve">Deobfuscate/Decode Files or Information</w:t>
+            </w:r>
+          </w:p>
+        </w:tc>
+        <w:tc>
+          <w:tcPr>
+            <w:tcW w:type="pct" w:w="800"/>
+            <w:vAlign w:val="center"/>
+          </w:tcPr>
+          <w:p>
+            <w:pPr>
+              <w:spacing w:line="276"/>
+              <w:jc w:val="left"/>
+            </w:pPr>
+            <w:r>
+              <w:rPr>
+                <w:rFonts w:ascii="Arial" w:cs="Arial" w:eastAsia="Arial" w:hAnsi="Arial"/>
+                <w:b w:val="false"/>
+                <w:bCs w:val="false"/>
+                <w:sz w:val="20"/>
+                <w:szCs w:val="20"/>
+              </w:rPr>
+              <w:t xml:space="preserve">T1140</w:t>
+            </w:r>
+          </w:p>
+        </w:tc>
+        <w:tc>
+          <w:tcPr>
+            <w:tcW w:type="pct" w:w="1650"/>
+            <w:vAlign w:val="center"/>
+          </w:tcPr>
+          <w:p>
+            <w:pPr>
+              <w:spacing w:line="276"/>
+              <w:jc w:val="left"/>
+            </w:pPr>
+            <w:r>
+              <w:rPr>
+                <w:rFonts w:ascii="Arial" w:cs="Arial" w:eastAsia="Arial" w:hAnsi="Arial"/>
+                <w:b w:val="false"/>
+                <w:bCs w:val="false"/>
+                <w:sz w:val="20"/>
+                <w:szCs w:val="20"/>
+              </w:rPr>
+              <w:t xml:space="preserve">base64 -d, xxd -r</w:t>
+            </w:r>
+          </w:p>
+        </w:tc>
+      </w:tr>
+      <w:tr>
+        <w:tc>
+          <w:tcPr>
+            <w:tcW w:type="pct" w:w="850"/>
+            <w:vAlign w:val="center"/>
+          </w:tcPr>
+          <w:p>
+            <w:pPr>
+              <w:spacing w:line="276"/>
+              <w:jc w:val="left"/>
+            </w:pPr>
+            <w:r>
+              <w:rPr>
+                <w:rFonts w:ascii="Arial" w:cs="Arial" w:eastAsia="Arial" w:hAnsi="Arial"/>
+                <w:b w:val="false"/>
+                <w:bCs w:val="false"/>
+                <w:sz w:val="20"/>
+                <w:szCs w:val="20"/>
+              </w:rPr>
+              <w:t xml:space="preserve">Defense Evasion</w:t>
+            </w:r>
+          </w:p>
+        </w:tc>
+        <w:tc>
+          <w:tcPr>
+            <w:tcW w:type="pct" w:w="1700"/>
+            <w:vAlign w:val="center"/>
+          </w:tcPr>
+          <w:p>
+            <w:pPr>
+              <w:spacing w:line="276"/>
+              <w:jc w:val="left"/>
+            </w:pPr>
+            <w:r>
+              <w:rPr>
+                <w:rFonts w:ascii="Arial" w:cs="Arial" w:eastAsia="Arial" w:hAnsi="Arial"/>
+                <w:b w:val="false"/>
+                <w:bCs w:val="false"/>
+                <w:sz w:val="20"/>
+                <w:szCs w:val="20"/>
+              </w:rPr>
+              <w:t xml:space="preserve">Impair Defenses: Disable or Modify System Firewall</w:t>
+            </w:r>
+          </w:p>
+        </w:tc>
+        <w:tc>
+          <w:tcPr>
+            <w:tcW w:type="pct" w:w="800"/>
+            <w:vAlign w:val="center"/>
+          </w:tcPr>
+          <w:p>
+            <w:pPr>
+              <w:spacing w:line="276"/>
+              <w:jc w:val="left"/>
+            </w:pPr>
+            <w:r>
+              <w:rPr>
+                <w:rFonts w:ascii="Arial" w:cs="Arial" w:eastAsia="Arial" w:hAnsi="Arial"/>
+                <w:b w:val="false"/>
+                <w:bCs w:val="false"/>
+                <w:sz w:val="20"/>
+                <w:szCs w:val="20"/>
+              </w:rPr>
+              <w:t xml:space="preserve">T1562.004</w:t>
+            </w:r>
+          </w:p>
+        </w:tc>
+        <w:tc>
+          <w:tcPr>
+            <w:tcW w:type="pct" w:w="1650"/>
+            <w:vAlign w:val="center"/>
+          </w:tcPr>
+          <w:p>
+            <w:pPr>
+              <w:spacing w:line="276"/>
+              <w:jc w:val="left"/>
+            </w:pPr>
+            <w:r>
+              <w:rPr>
+                <w:rFonts w:ascii="Arial" w:cs="Arial" w:eastAsia="Arial" w:hAnsi="Arial"/>
+                <w:b w:val="false"/>
+                <w:bCs w:val="false"/>
+                <w:sz w:val="20"/>
+                <w:szCs w:val="20"/>
+              </w:rPr>
+              <w:t xml:space="preserve">iptables -F, ufw disable</w:t>
+            </w:r>
+          </w:p>
+        </w:tc>
+      </w:tr>
+      <w:tr>
+        <w:tc>
+          <w:tcPr>
+            <w:tcW w:type="pct" w:w="850"/>
+            <w:vAlign w:val="center"/>
+          </w:tcPr>
+          <w:p>
+            <w:pPr>
+              <w:spacing w:line="276"/>
+              <w:jc w:val="left"/>
+            </w:pPr>
+            <w:r>
+              <w:rPr>
+                <w:rFonts w:ascii="Arial" w:cs="Arial" w:eastAsia="Arial" w:hAnsi="Arial"/>
+                <w:b w:val="false"/>
+                <w:bCs w:val="false"/>
+                <w:sz w:val="20"/>
+                <w:szCs w:val="20"/>
+              </w:rPr>
+              <w:t xml:space="preserve">Credential Access</w:t>
+            </w:r>
+          </w:p>
+        </w:tc>
+        <w:tc>
+          <w:tcPr>
+            <w:tcW w:type="pct" w:w="1700"/>
+            <w:vAlign w:val="center"/>
+          </w:tcPr>
+          <w:p>
+            <w:pPr>
+              <w:spacing w:line="276"/>
+              <w:jc w:val="left"/>
+            </w:pPr>
+            <w:r>
+              <w:rPr>
+                <w:rFonts w:ascii="Arial" w:cs="Arial" w:eastAsia="Arial" w:hAnsi="Arial"/>
+                <w:b w:val="false"/>
+                <w:bCs w:val="false"/>
+                <w:sz w:val="20"/>
+                <w:szCs w:val="20"/>
+              </w:rPr>
+              <w:t xml:space="preserve">Brute Force: Password Guessing</w:t>
+            </w:r>
+          </w:p>
+        </w:tc>
+        <w:tc>
+          <w:tcPr>
+            <w:tcW w:type="pct" w:w="800"/>
+            <w:vAlign w:val="center"/>
+          </w:tcPr>
+          <w:p>
+            <w:pPr>
+              <w:spacing w:line="276"/>
+              <w:jc w:val="left"/>
+            </w:pPr>
+            <w:r>
+              <w:rPr>
+                <w:rFonts w:ascii="Arial" w:cs="Arial" w:eastAsia="Arial" w:hAnsi="Arial"/>
+                <w:b w:val="false"/>
+                <w:bCs w:val="false"/>
+                <w:sz w:val="20"/>
+                <w:szCs w:val="20"/>
+              </w:rPr>
+              <w:t xml:space="preserve">T1110.001</w:t>
+            </w:r>
+          </w:p>
+        </w:tc>
+        <w:tc>
+          <w:tcPr>
+            <w:tcW w:type="pct" w:w="1650"/>
+            <w:vAlign w:val="center"/>
+          </w:tcPr>
+          <w:p>
+            <w:pPr>
+              <w:spacing w:line="276"/>
+              <w:jc w:val="left"/>
+            </w:pPr>
+            <w:r>
+              <w:rPr>
+                <w:rFonts w:ascii="Arial" w:cs="Arial" w:eastAsia="Arial" w:hAnsi="Arial"/>
+                <w:b w:val="false"/>
+                <w:bCs w:val="false"/>
+                <w:sz w:val="20"/>
+                <w:szCs w:val="20"/>
+              </w:rPr>
+              <w:t xml:space="preserve">Evento cowrie.login.failed</w:t>
+            </w:r>
+          </w:p>
+        </w:tc>
+      </w:tr>
+      <w:tr>
+        <w:tc>
+          <w:tcPr>
+            <w:tcW w:type="pct" w:w="850"/>
+            <w:vAlign w:val="center"/>
+          </w:tcPr>
+          <w:p>
+            <w:pPr>
+              <w:spacing w:line="276"/>
+              <w:jc w:val="left"/>
+            </w:pPr>
+            <w:r>
+              <w:rPr>
+                <w:rFonts w:ascii="Arial" w:cs="Arial" w:eastAsia="Arial" w:hAnsi="Arial"/>
+                <w:b w:val="false"/>
+                <w:bCs w:val="false"/>
+                <w:sz w:val="20"/>
+                <w:szCs w:val="20"/>
+              </w:rPr>
+              <w:t xml:space="preserve">Credential Access</w:t>
+            </w:r>
+          </w:p>
+        </w:tc>
+        <w:tc>
+          <w:tcPr>
+            <w:tcW w:type="pct" w:w="1700"/>
+            <w:vAlign w:val="center"/>
+          </w:tcPr>
+          <w:p>
+            <w:pPr>
+              <w:spacing w:line="276"/>
+              <w:jc w:val="left"/>
+            </w:pPr>
+            <w:r>
+              <w:rPr>
+                <w:rFonts w:ascii="Arial" w:cs="Arial" w:eastAsia="Arial" w:hAnsi="Arial"/>
+                <w:b w:val="false"/>
+                <w:bCs w:val="false"/>
+                <w:sz w:val="20"/>
+                <w:szCs w:val="20"/>
+              </w:rPr>
+              <w:t xml:space="preserve">OS Credential Dumping: /etc/passwd and /etc/shadow</w:t>
+            </w:r>
+          </w:p>
+        </w:tc>
+        <w:tc>
+          <w:tcPr>
+            <w:tcW w:type="pct" w:w="800"/>
+            <w:vAlign w:val="center"/>
+          </w:tcPr>
+          <w:p>
+            <w:pPr>
+              <w:spacing w:line="276"/>
+              <w:jc w:val="left"/>
+            </w:pPr>
+            <w:r>
+              <w:rPr>
+                <w:rFonts w:ascii="Arial" w:cs="Arial" w:eastAsia="Arial" w:hAnsi="Arial"/>
+                <w:b w:val="false"/>
+                <w:bCs w:val="false"/>
+                <w:sz w:val="20"/>
+                <w:szCs w:val="20"/>
+              </w:rPr>
+              <w:t xml:space="preserve">T1003.008</w:t>
+            </w:r>
+          </w:p>
+        </w:tc>
+        <w:tc>
+          <w:tcPr>
+            <w:tcW w:type="pct" w:w="1650"/>
+            <w:vAlign w:val="center"/>
+          </w:tcPr>
+          <w:p>
+            <w:pPr>
+              <w:spacing w:line="276"/>
+              <w:jc w:val="left"/>
+            </w:pPr>
+            <w:r>
+              <w:rPr>
+                <w:rFonts w:ascii="Arial" w:cs="Arial" w:eastAsia="Arial" w:hAnsi="Arial"/>
+                <w:b w:val="false"/>
+                <w:bCs w:val="false"/>
+                <w:sz w:val="20"/>
+                <w:szCs w:val="20"/>
+              </w:rPr>
+              <w:t xml:space="preserve">Lectura de /etc/shadow</w:t>
+            </w:r>
+          </w:p>
+        </w:tc>
+      </w:tr>
+      <w:tr>
+        <w:tc>
+          <w:tcPr>
+            <w:tcW w:type="pct" w:w="850"/>
+            <w:vAlign w:val="center"/>
+          </w:tcPr>
+          <w:p>
+            <w:pPr>
+              <w:spacing w:line="276"/>
+              <w:jc w:val="left"/>
+            </w:pPr>
+            <w:r>
+              <w:rPr>
+                <w:rFonts w:ascii="Arial" w:cs="Arial" w:eastAsia="Arial" w:hAnsi="Arial"/>
+                <w:b w:val="false"/>
+                <w:bCs w:val="false"/>
+                <w:sz w:val="20"/>
+                <w:szCs w:val="20"/>
+              </w:rPr>
+              <w:t xml:space="preserve">Discovery</w:t>
+            </w:r>
+          </w:p>
+        </w:tc>
+        <w:tc>
+          <w:tcPr>
+            <w:tcW w:type="pct" w:w="1700"/>
+            <w:vAlign w:val="center"/>
+          </w:tcPr>
+          <w:p>
+            <w:pPr>
+              <w:spacing w:line="276"/>
+              <w:jc w:val="left"/>
+            </w:pPr>
+            <w:r>
+              <w:rPr>
+                <w:rFonts w:ascii="Arial" w:cs="Arial" w:eastAsia="Arial" w:hAnsi="Arial"/>
+                <w:b w:val="false"/>
+                <w:bCs w:val="false"/>
+                <w:sz w:val="20"/>
+                <w:szCs w:val="20"/>
+              </w:rPr>
+              <w:t xml:space="preserve">System Information Discovery</w:t>
+            </w:r>
+          </w:p>
+        </w:tc>
+        <w:tc>
+          <w:tcPr>
+            <w:tcW w:type="pct" w:w="800"/>
+            <w:vAlign w:val="center"/>
+          </w:tcPr>
+          <w:p>
+            <w:pPr>
+              <w:spacing w:line="276"/>
+              <w:jc w:val="left"/>
+            </w:pPr>
+            <w:r>
+              <w:rPr>
+                <w:rFonts w:ascii="Arial" w:cs="Arial" w:eastAsia="Arial" w:hAnsi="Arial"/>
+                <w:b w:val="false"/>
+                <w:bCs w:val="false"/>
+                <w:sz w:val="20"/>
+                <w:szCs w:val="20"/>
+              </w:rPr>
+              <w:t xml:space="preserve">T1082</w:t>
+            </w:r>
+          </w:p>
+        </w:tc>
+        <w:tc>
+          <w:tcPr>
+            <w:tcW w:type="pct" w:w="1650"/>
+            <w:vAlign w:val="center"/>
+          </w:tcPr>
+          <w:p>
+            <w:pPr>
+              <w:spacing w:line="276"/>
+              <w:jc w:val="left"/>
+            </w:pPr>
+            <w:r>
+              <w:rPr>
+                <w:rFonts w:ascii="Arial" w:cs="Arial" w:eastAsia="Arial" w:hAnsi="Arial"/>
+                <w:b w:val="false"/>
+                <w:bCs w:val="false"/>
+                <w:sz w:val="20"/>
+                <w:szCs w:val="20"/>
+              </w:rPr>
+              <w:t xml:space="preserve">uname, /proc/cpuinfo, free, nproc, lscpu</w:t>
+            </w:r>
+          </w:p>
+        </w:tc>
+      </w:tr>
+      <w:tr>
+        <w:tc>
+          <w:tcPr>
+            <w:tcW w:type="pct" w:w="850"/>
+            <w:vAlign w:val="center"/>
+          </w:tcPr>
+          <w:p>
+            <w:pPr>
+              <w:spacing w:line="276"/>
+              <w:jc w:val="left"/>
+            </w:pPr>
+            <w:r>
+              <w:rPr>
+                <w:rFonts w:ascii="Arial" w:cs="Arial" w:eastAsia="Arial" w:hAnsi="Arial"/>
+                <w:b w:val="false"/>
+                <w:bCs w:val="false"/>
+                <w:sz w:val="20"/>
+                <w:szCs w:val="20"/>
+              </w:rPr>
+              <w:t xml:space="preserve">Discovery</w:t>
+            </w:r>
+          </w:p>
+        </w:tc>
+        <w:tc>
+          <w:tcPr>
+            <w:tcW w:type="pct" w:w="1700"/>
+            <w:vAlign w:val="center"/>
+          </w:tcPr>
+          <w:p>
+            <w:pPr>
+              <w:spacing w:line="276"/>
+              <w:jc w:val="left"/>
+            </w:pPr>
+            <w:r>
+              <w:rPr>
+                <w:rFonts w:ascii="Arial" w:cs="Arial" w:eastAsia="Arial" w:hAnsi="Arial"/>
+                <w:b w:val="false"/>
+                <w:bCs w:val="false"/>
+                <w:sz w:val="20"/>
+                <w:szCs w:val="20"/>
+              </w:rPr>
+              <w:t xml:space="preserve">Account Discovery: Local Account</w:t>
+            </w:r>
+          </w:p>
+        </w:tc>
+        <w:tc>
+          <w:tcPr>
+            <w:tcW w:type="pct" w:w="800"/>
+            <w:vAlign w:val="center"/>
+          </w:tcPr>
+          <w:p>
+            <w:pPr>
+              <w:spacing w:line="276"/>
+              <w:jc w:val="left"/>
+            </w:pPr>
+            <w:r>
+              <w:rPr>
+                <w:rFonts w:ascii="Arial" w:cs="Arial" w:eastAsia="Arial" w:hAnsi="Arial"/>
+                <w:b w:val="false"/>
+                <w:bCs w:val="false"/>
+                <w:sz w:val="20"/>
+                <w:szCs w:val="20"/>
+              </w:rPr>
+              <w:t xml:space="preserve">T1087.001</w:t>
+            </w:r>
+          </w:p>
+        </w:tc>
+        <w:tc>
+          <w:tcPr>
+            <w:tcW w:type="pct" w:w="1650"/>
+            <w:vAlign w:val="center"/>
+          </w:tcPr>
+          <w:p>
+            <w:pPr>
+              <w:spacing w:line="276"/>
+              <w:jc w:val="left"/>
+            </w:pPr>
+            <w:r>
+              <w:rPr>
+                <w:rFonts w:ascii="Arial" w:cs="Arial" w:eastAsia="Arial" w:hAnsi="Arial"/>
+                <w:b w:val="false"/>
+                <w:bCs w:val="false"/>
+                <w:sz w:val="20"/>
+                <w:szCs w:val="20"/>
+              </w:rPr>
+              <w:t xml:space="preserve">Lectura de /etc/passwd y /etc/group</w:t>
+            </w:r>
+          </w:p>
+        </w:tc>
+      </w:tr>
+      <w:tr>
+        <w:tc>
+          <w:tcPr>
+            <w:tcW w:type="pct" w:w="850"/>
+            <w:vAlign w:val="center"/>
+          </w:tcPr>
+          <w:p>
+            <w:pPr>
+              <w:spacing w:line="276"/>
+              <w:jc w:val="left"/>
+            </w:pPr>
+            <w:r>
+              <w:rPr>
+                <w:rFonts w:ascii="Arial" w:cs="Arial" w:eastAsia="Arial" w:hAnsi="Arial"/>
+                <w:b w:val="false"/>
+                <w:bCs w:val="false"/>
+                <w:sz w:val="20"/>
+                <w:szCs w:val="20"/>
+              </w:rPr>
+              <w:t xml:space="preserve">Discovery</w:t>
+            </w:r>
+          </w:p>
+        </w:tc>
+        <w:tc>
+          <w:tcPr>
+            <w:tcW w:type="pct" w:w="1700"/>
+            <w:vAlign w:val="center"/>
+          </w:tcPr>
+          <w:p>
+            <w:pPr>
+              <w:spacing w:line="276"/>
+              <w:jc w:val="left"/>
+            </w:pPr>
+            <w:r>
+              <w:rPr>
+                <w:rFonts w:ascii="Arial" w:cs="Arial" w:eastAsia="Arial" w:hAnsi="Arial"/>
+                <w:b w:val="false"/>
+                <w:bCs w:val="false"/>
+                <w:sz w:val="20"/>
+                <w:szCs w:val="20"/>
+              </w:rPr>
+              <w:t xml:space="preserve">System Owner/User Discovery</w:t>
+            </w:r>
+          </w:p>
+        </w:tc>
+        <w:tc>
+          <w:tcPr>
+            <w:tcW w:type="pct" w:w="800"/>
+            <w:vAlign w:val="center"/>
+          </w:tcPr>
+          <w:p>
+            <w:pPr>
+              <w:spacing w:line="276"/>
+              <w:jc w:val="left"/>
+            </w:pPr>
+            <w:r>
+              <w:rPr>
+                <w:rFonts w:ascii="Arial" w:cs="Arial" w:eastAsia="Arial" w:hAnsi="Arial"/>
+                <w:b w:val="false"/>
+                <w:bCs w:val="false"/>
+                <w:sz w:val="20"/>
+                <w:szCs w:val="20"/>
+              </w:rPr>
+              <w:t xml:space="preserve">T1033</w:t>
+            </w:r>
+          </w:p>
+        </w:tc>
+        <w:tc>
+          <w:tcPr>
+            <w:tcW w:type="pct" w:w="1650"/>
+            <w:vAlign w:val="center"/>
+          </w:tcPr>
+          <w:p>
+            <w:pPr>
+              <w:spacing w:line="276"/>
+              <w:jc w:val="left"/>
+            </w:pPr>
+            <w:r>
+              <w:rPr>
+                <w:rFonts w:ascii="Arial" w:cs="Arial" w:eastAsia="Arial" w:hAnsi="Arial"/>
+                <w:b w:val="false"/>
+                <w:bCs w:val="false"/>
+                <w:sz w:val="20"/>
+                <w:szCs w:val="20"/>
+              </w:rPr>
+              <w:t xml:space="preserve">whoami, id, w, who, last</w:t>
+            </w:r>
+          </w:p>
+        </w:tc>
+      </w:tr>
+      <w:tr>
+        <w:tc>
+          <w:tcPr>
+            <w:tcW w:type="pct" w:w="850"/>
+            <w:vAlign w:val="center"/>
+          </w:tcPr>
+          <w:p>
+            <w:pPr>
+              <w:spacing w:line="276"/>
+              <w:jc w:val="left"/>
+            </w:pPr>
+            <w:r>
+              <w:rPr>
+                <w:rFonts w:ascii="Arial" w:cs="Arial" w:eastAsia="Arial" w:hAnsi="Arial"/>
+                <w:b w:val="false"/>
+                <w:bCs w:val="false"/>
+                <w:sz w:val="20"/>
+                <w:szCs w:val="20"/>
+              </w:rPr>
+              <w:t xml:space="preserve">Discovery</w:t>
+            </w:r>
+          </w:p>
+        </w:tc>
+        <w:tc>
+          <w:tcPr>
+            <w:tcW w:type="pct" w:w="1700"/>
+            <w:vAlign w:val="center"/>
+          </w:tcPr>
+          <w:p>
+            <w:pPr>
+              <w:spacing w:line="276"/>
+              <w:jc w:val="left"/>
+            </w:pPr>
+            <w:r>
+              <w:rPr>
+                <w:rFonts w:ascii="Arial" w:cs="Arial" w:eastAsia="Arial" w:hAnsi="Arial"/>
+                <w:b w:val="false"/>
+                <w:bCs w:val="false"/>
+                <w:sz w:val="20"/>
+                <w:szCs w:val="20"/>
+              </w:rPr>
+              <w:t xml:space="preserve">Process Discovery</w:t>
+            </w:r>
+          </w:p>
+        </w:tc>
+        <w:tc>
+          <w:tcPr>
+            <w:tcW w:type="pct" w:w="800"/>
+            <w:vAlign w:val="center"/>
+          </w:tcPr>
+          <w:p>
+            <w:pPr>
+              <w:spacing w:line="276"/>
+              <w:jc w:val="left"/>
+            </w:pPr>
+            <w:r>
+              <w:rPr>
+                <w:rFonts w:ascii="Arial" w:cs="Arial" w:eastAsia="Arial" w:hAnsi="Arial"/>
+                <w:b w:val="false"/>
+                <w:bCs w:val="false"/>
+                <w:sz w:val="20"/>
+                <w:szCs w:val="20"/>
+              </w:rPr>
+              <w:t xml:space="preserve">T1057</w:t>
+            </w:r>
+          </w:p>
+        </w:tc>
+        <w:tc>
+          <w:tcPr>
+            <w:tcW w:type="pct" w:w="1650"/>
+            <w:vAlign w:val="center"/>
+          </w:tcPr>
+          <w:p>
+            <w:pPr>
+              <w:spacing w:line="276"/>
+              <w:jc w:val="left"/>
+            </w:pPr>
+            <w:r>
+              <w:rPr>
+                <w:rFonts w:ascii="Arial" w:cs="Arial" w:eastAsia="Arial" w:hAnsi="Arial"/>
+                <w:b w:val="false"/>
+                <w:bCs w:val="false"/>
+                <w:sz w:val="20"/>
+                <w:szCs w:val="20"/>
+              </w:rPr>
+              <w:t xml:space="preserve">ps, top, pgrep, pidof</w:t>
+            </w:r>
+          </w:p>
+        </w:tc>
+      </w:tr>
+      <w:tr>
+        <w:tc>
+          <w:tcPr>
+            <w:tcW w:type="pct" w:w="850"/>
+            <w:vAlign w:val="center"/>
+          </w:tcPr>
+          <w:p>
+            <w:pPr>
+              <w:spacing w:line="276"/>
+              <w:jc w:val="left"/>
+            </w:pPr>
+            <w:r>
+              <w:rPr>
+                <w:rFonts w:ascii="Arial" w:cs="Arial" w:eastAsia="Arial" w:hAnsi="Arial"/>
+                <w:b w:val="false"/>
+                <w:bCs w:val="false"/>
+                <w:sz w:val="20"/>
+                <w:szCs w:val="20"/>
+              </w:rPr>
+              <w:t xml:space="preserve">Discovery</w:t>
+            </w:r>
+          </w:p>
+        </w:tc>
+        <w:tc>
+          <w:tcPr>
+            <w:tcW w:type="pct" w:w="1700"/>
+            <w:vAlign w:val="center"/>
+          </w:tcPr>
+          <w:p>
+            <w:pPr>
+              <w:spacing w:line="276"/>
+              <w:jc w:val="left"/>
+            </w:pPr>
+            <w:r>
+              <w:rPr>
+                <w:rFonts w:ascii="Arial" w:cs="Arial" w:eastAsia="Arial" w:hAnsi="Arial"/>
+                <w:b w:val="false"/>
+                <w:bCs w:val="false"/>
+                <w:sz w:val="20"/>
+                <w:szCs w:val="20"/>
+              </w:rPr>
+              <w:t xml:space="preserve">System Network Configuration Discovery</w:t>
+            </w:r>
+          </w:p>
+        </w:tc>
+        <w:tc>
+          <w:tcPr>
+            <w:tcW w:type="pct" w:w="800"/>
+            <w:vAlign w:val="center"/>
+          </w:tcPr>
+          <w:p>
+            <w:pPr>
+              <w:spacing w:line="276"/>
+              <w:jc w:val="left"/>
+            </w:pPr>
+            <w:r>
+              <w:rPr>
+                <w:rFonts w:ascii="Arial" w:cs="Arial" w:eastAsia="Arial" w:hAnsi="Arial"/>
+                <w:b w:val="false"/>
+                <w:bCs w:val="false"/>
+                <w:sz w:val="20"/>
+                <w:szCs w:val="20"/>
+              </w:rPr>
+              <w:t xml:space="preserve">T1016</w:t>
+            </w:r>
+          </w:p>
+        </w:tc>
+        <w:tc>
+          <w:tcPr>
+            <w:tcW w:type="pct" w:w="1650"/>
+            <w:vAlign w:val="center"/>
+          </w:tcPr>
+          <w:p>
+            <w:pPr>
+              <w:spacing w:line="276"/>
+              <w:jc w:val="left"/>
+            </w:pPr>
+            <w:r>
+              <w:rPr>
+                <w:rFonts w:ascii="Arial" w:cs="Arial" w:eastAsia="Arial" w:hAnsi="Arial"/>
+                <w:b w:val="false"/>
+                <w:bCs w:val="false"/>
+                <w:sz w:val="20"/>
+                <w:szCs w:val="20"/>
+              </w:rPr>
+              <w:t xml:space="preserve">ifconfig, ip a, route, resolv.conf</w:t>
+            </w:r>
+          </w:p>
+        </w:tc>
+      </w:tr>
+      <w:tr>
+        <w:tc>
+          <w:tcPr>
+            <w:tcW w:type="pct" w:w="850"/>
+            <w:vAlign w:val="center"/>
+          </w:tcPr>
+          <w:p>
+            <w:pPr>
+              <w:spacing w:line="276"/>
+              <w:jc w:val="left"/>
+            </w:pPr>
+            <w:r>
+              <w:rPr>
+                <w:rFonts w:ascii="Arial" w:cs="Arial" w:eastAsia="Arial" w:hAnsi="Arial"/>
+                <w:b w:val="false"/>
+                <w:bCs w:val="false"/>
+                <w:sz w:val="20"/>
+                <w:szCs w:val="20"/>
+              </w:rPr>
+              <w:t xml:space="preserve">Discovery</w:t>
+            </w:r>
+          </w:p>
+        </w:tc>
+        <w:tc>
+          <w:tcPr>
+            <w:tcW w:type="pct" w:w="1700"/>
+            <w:vAlign w:val="center"/>
+          </w:tcPr>
+          <w:p>
+            <w:pPr>
+              <w:spacing w:line="276"/>
+              <w:jc w:val="left"/>
+            </w:pPr>
+            <w:r>
+              <w:rPr>
+                <w:rFonts w:ascii="Arial" w:cs="Arial" w:eastAsia="Arial" w:hAnsi="Arial"/>
+                <w:b w:val="false"/>
+                <w:bCs w:val="false"/>
+                <w:sz w:val="20"/>
+                <w:szCs w:val="20"/>
+              </w:rPr>
+              <w:t xml:space="preserve">System Network Connections Discovery</w:t>
+            </w:r>
+          </w:p>
+        </w:tc>
+        <w:tc>
+          <w:tcPr>
+            <w:tcW w:type="pct" w:w="800"/>
+            <w:vAlign w:val="center"/>
+          </w:tcPr>
+          <w:p>
+            <w:pPr>
+              <w:spacing w:line="276"/>
+              <w:jc w:val="left"/>
+            </w:pPr>
+            <w:r>
+              <w:rPr>
+                <w:rFonts w:ascii="Arial" w:cs="Arial" w:eastAsia="Arial" w:hAnsi="Arial"/>
+                <w:b w:val="false"/>
+                <w:bCs w:val="false"/>
+                <w:sz w:val="20"/>
+                <w:szCs w:val="20"/>
+              </w:rPr>
+              <w:t xml:space="preserve">T1049</w:t>
+            </w:r>
+          </w:p>
+        </w:tc>
+        <w:tc>
+          <w:tcPr>
+            <w:tcW w:type="pct" w:w="1650"/>
+            <w:vAlign w:val="center"/>
+          </w:tcPr>
+          <w:p>
+            <w:pPr>
+              <w:spacing w:line="276"/>
+              <w:jc w:val="left"/>
+            </w:pPr>
+            <w:r>
+              <w:rPr>
+                <w:rFonts w:ascii="Arial" w:cs="Arial" w:eastAsia="Arial" w:hAnsi="Arial"/>
+                <w:b w:val="false"/>
+                <w:bCs w:val="false"/>
+                <w:sz w:val="20"/>
+                <w:szCs w:val="20"/>
+              </w:rPr>
+              <w:t xml:space="preserve">netstat, ss, lsof -i</w:t>
+            </w:r>
+          </w:p>
+        </w:tc>
+      </w:tr>
+      <w:tr>
+        <w:tc>
+          <w:tcPr>
+            <w:tcW w:type="pct" w:w="850"/>
+            <w:vAlign w:val="center"/>
+          </w:tcPr>
+          <w:p>
+            <w:pPr>
+              <w:spacing w:line="276"/>
+              <w:jc w:val="left"/>
+            </w:pPr>
+            <w:r>
+              <w:rPr>
+                <w:rFonts w:ascii="Arial" w:cs="Arial" w:eastAsia="Arial" w:hAnsi="Arial"/>
+                <w:b w:val="false"/>
+                <w:bCs w:val="false"/>
+                <w:sz w:val="20"/>
+                <w:szCs w:val="20"/>
+              </w:rPr>
+              <w:t xml:space="preserve">Discovery</w:t>
+            </w:r>
+          </w:p>
+        </w:tc>
+        <w:tc>
+          <w:tcPr>
+            <w:tcW w:type="pct" w:w="1700"/>
+            <w:vAlign w:val="center"/>
+          </w:tcPr>
+          <w:p>
+            <w:pPr>
+              <w:spacing w:line="276"/>
+              <w:jc w:val="left"/>
+            </w:pPr>
+            <w:r>
+              <w:rPr>
+                <w:rFonts w:ascii="Arial" w:cs="Arial" w:eastAsia="Arial" w:hAnsi="Arial"/>
+                <w:b w:val="false"/>
+                <w:bCs w:val="false"/>
+                <w:sz w:val="20"/>
+                <w:szCs w:val="20"/>
+              </w:rPr>
+              <w:t xml:space="preserve">File and Directory Discovery</w:t>
+            </w:r>
+          </w:p>
+        </w:tc>
+        <w:tc>
+          <w:tcPr>
+            <w:tcW w:type="pct" w:w="800"/>
+            <w:vAlign w:val="center"/>
+          </w:tcPr>
+          <w:p>
+            <w:pPr>
+              <w:spacing w:line="276"/>
+              <w:jc w:val="left"/>
+            </w:pPr>
+            <w:r>
+              <w:rPr>
+                <w:rFonts w:ascii="Arial" w:cs="Arial" w:eastAsia="Arial" w:hAnsi="Arial"/>
+                <w:b w:val="false"/>
+                <w:bCs w:val="false"/>
+                <w:sz w:val="20"/>
+                <w:szCs w:val="20"/>
+              </w:rPr>
+              <w:t xml:space="preserve">T1083</w:t>
+            </w:r>
+          </w:p>
+        </w:tc>
+        <w:tc>
+          <w:tcPr>
+            <w:tcW w:type="pct" w:w="1650"/>
+            <w:vAlign w:val="center"/>
+          </w:tcPr>
+          <w:p>
+            <w:pPr>
+              <w:spacing w:line="276"/>
+              <w:jc w:val="left"/>
+            </w:pPr>
+            <w:r>
+              <w:rPr>
+                <w:rFonts w:ascii="Arial" w:cs="Arial" w:eastAsia="Arial" w:hAnsi="Arial"/>
+                <w:b w:val="false"/>
+                <w:bCs w:val="false"/>
+                <w:sz w:val="20"/>
+                <w:szCs w:val="20"/>
+              </w:rPr>
+              <w:t xml:space="preserve">ls, find /</w:t>
+            </w:r>
+          </w:p>
+        </w:tc>
+      </w:tr>
+      <w:tr>
+        <w:tc>
+          <w:tcPr>
+            <w:tcW w:type="pct" w:w="850"/>
+            <w:vAlign w:val="center"/>
+          </w:tcPr>
+          <w:p>
+            <w:pPr>
+              <w:spacing w:line="276"/>
+              <w:jc w:val="left"/>
+            </w:pPr>
+            <w:r>
+              <w:rPr>
+                <w:rFonts w:ascii="Arial" w:cs="Arial" w:eastAsia="Arial" w:hAnsi="Arial"/>
+                <w:b w:val="false"/>
+                <w:bCs w:val="false"/>
+                <w:sz w:val="20"/>
+                <w:szCs w:val="20"/>
+              </w:rPr>
+              <w:t xml:space="preserve">Command and Control</w:t>
+            </w:r>
+          </w:p>
+        </w:tc>
+        <w:tc>
+          <w:tcPr>
+            <w:tcW w:type="pct" w:w="1700"/>
+            <w:vAlign w:val="center"/>
+          </w:tcPr>
+          <w:p>
+            <w:pPr>
+              <w:spacing w:line="276"/>
+              <w:jc w:val="left"/>
+            </w:pPr>
+            <w:r>
+              <w:rPr>
+                <w:rFonts w:ascii="Arial" w:cs="Arial" w:eastAsia="Arial" w:hAnsi="Arial"/>
+                <w:b w:val="false"/>
+                <w:bCs w:val="false"/>
+                <w:sz w:val="20"/>
+                <w:szCs w:val="20"/>
+              </w:rPr>
+              <w:t xml:space="preserve">Ingress Tool Transfer</w:t>
+            </w:r>
+          </w:p>
+        </w:tc>
+        <w:tc>
+          <w:tcPr>
+            <w:tcW w:type="pct" w:w="800"/>
+            <w:vAlign w:val="center"/>
+          </w:tcPr>
+          <w:p>
+            <w:pPr>
+              <w:spacing w:line="276"/>
+              <w:jc w:val="left"/>
+            </w:pPr>
+            <w:r>
+              <w:rPr>
+                <w:rFonts w:ascii="Arial" w:cs="Arial" w:eastAsia="Arial" w:hAnsi="Arial"/>
+                <w:b w:val="false"/>
+                <w:bCs w:val="false"/>
+                <w:sz w:val="20"/>
+                <w:szCs w:val="20"/>
+              </w:rPr>
+              <w:t xml:space="preserve">T1105</w:t>
+            </w:r>
+          </w:p>
+        </w:tc>
+        <w:tc>
+          <w:tcPr>
+            <w:tcW w:type="pct" w:w="1650"/>
+            <w:vAlign w:val="center"/>
+          </w:tcPr>
+          <w:p>
+            <w:pPr>
+              <w:spacing w:line="276"/>
+              <w:jc w:val="left"/>
+            </w:pPr>
+            <w:r>
+              <w:rPr>
+                <w:rFonts w:ascii="Arial" w:cs="Arial" w:eastAsia="Arial" w:hAnsi="Arial"/>
+                <w:b w:val="false"/>
+                <w:bCs w:val="false"/>
+                <w:sz w:val="20"/>
+                <w:szCs w:val="20"/>
+              </w:rPr>
+              <w:t xml:space="preserve">wget, curl, tftp, ftpget, /dev/tcp</w:t>
+            </w:r>
+          </w:p>
+        </w:tc>
+      </w:tr>
+      <w:tr>
+        <w:tc>
+          <w:tcPr>
+            <w:tcW w:type="pct" w:w="850"/>
             <w:vAlign w:val="center"/>
           </w:tcPr>
           <w:p>
@@ -15693,64 +16899,67 @@
         </w:tc>
         <w:tc>
           <w:tcPr>
-            <w:vAlign w:val="center"/>
-          </w:tcPr>
-          <w:p>
-            <w:pPr>
-              <w:spacing w:line="276"/>
-              <w:jc w:val="left"/>
-            </w:pPr>
-            <w:r>
-              <w:rPr>
-                <w:rFonts w:ascii="Arial" w:cs="Arial" w:eastAsia="Arial" w:hAnsi="Arial"/>
-                <w:b w:val="false"/>
-                <w:bCs w:val="false"/>
-                <w:sz w:val="20"/>
-                <w:szCs w:val="20"/>
-              </w:rPr>
-              <w:t xml:space="preserve">Resource Hijacking</w:t>
-            </w:r>
-          </w:p>
-        </w:tc>
-        <w:tc>
-          <w:tcPr>
-            <w:vAlign w:val="center"/>
-          </w:tcPr>
-          <w:p>
-            <w:pPr>
-              <w:spacing w:line="276"/>
-              <w:jc w:val="center"/>
-            </w:pPr>
-            <w:r>
-              <w:rPr>
-                <w:rFonts w:ascii="Arial" w:cs="Arial" w:eastAsia="Arial" w:hAnsi="Arial"/>
-                <w:b w:val="false"/>
-                <w:bCs w:val="false"/>
-                <w:sz w:val="20"/>
-                <w:szCs w:val="20"/>
-              </w:rPr>
-              <w:t xml:space="preserve">T1496</w:t>
-            </w:r>
-          </w:p>
-        </w:tc>
-        <w:tc>
-          <w:tcPr>
-            <w:vAlign w:val="center"/>
-          </w:tcPr>
-          <w:p>
-            <w:pPr>
-              <w:spacing w:line="276"/>
-              <w:jc w:val="left"/>
-            </w:pPr>
-            <w:r>
-              <w:rPr>
-                <w:rFonts w:ascii="Arial" w:cs="Arial" w:eastAsia="Arial" w:hAnsi="Arial"/>
-                <w:b w:val="false"/>
-                <w:bCs w:val="false"/>
-                <w:sz w:val="20"/>
-                <w:szCs w:val="20"/>
-              </w:rPr>
-              <w:t xml:space="preserve">Descarga de criptomineros (xmrig)</w:t>
+            <w:tcW w:type="pct" w:w="1700"/>
+            <w:vAlign w:val="center"/>
+          </w:tcPr>
+          <w:p>
+            <w:pPr>
+              <w:spacing w:line="276"/>
+              <w:jc w:val="left"/>
+            </w:pPr>
+            <w:r>
+              <w:rPr>
+                <w:rFonts w:ascii="Arial" w:cs="Arial" w:eastAsia="Arial" w:hAnsi="Arial"/>
+                <w:b w:val="false"/>
+                <w:bCs w:val="false"/>
+                <w:sz w:val="20"/>
+                <w:szCs w:val="20"/>
+              </w:rPr>
+              <w:t xml:space="preserve">Resource Hijacking: Compute Hijacking</w:t>
+            </w:r>
+          </w:p>
+        </w:tc>
+        <w:tc>
+          <w:tcPr>
+            <w:tcW w:type="pct" w:w="800"/>
+            <w:vAlign w:val="center"/>
+          </w:tcPr>
+          <w:p>
+            <w:pPr>
+              <w:spacing w:line="276"/>
+              <w:jc w:val="left"/>
+            </w:pPr>
+            <w:r>
+              <w:rPr>
+                <w:rFonts w:ascii="Arial" w:cs="Arial" w:eastAsia="Arial" w:hAnsi="Arial"/>
+                <w:b w:val="false"/>
+                <w:bCs w:val="false"/>
+                <w:sz w:val="20"/>
+                <w:szCs w:val="20"/>
+              </w:rPr>
+              <w:t xml:space="preserve">T1496.001</w:t>
+            </w:r>
+          </w:p>
+        </w:tc>
+        <w:tc>
+          <w:tcPr>
+            <w:tcW w:type="pct" w:w="1650"/>
+            <w:vAlign w:val="center"/>
+          </w:tcPr>
+          <w:p>
+            <w:pPr>
+              <w:spacing w:line="276"/>
+              <w:jc w:val="left"/>
+            </w:pPr>
+            <w:r>
+              <w:rPr>
+                <w:rFonts w:ascii="Arial" w:cs="Arial" w:eastAsia="Arial" w:hAnsi="Arial"/>
+                <w:b w:val="false"/>
+                <w:bCs w:val="false"/>
+                <w:sz w:val="20"/>
+                <w:szCs w:val="20"/>
+              </w:rPr>
+              <w:t xml:space="preserve">xmrig, minerd, stratum+tcp, miner</w:t>
             </w:r>
           </w:p>
         </w:tc>
@@ -15771,20 +16980,7 @@
           <w:sz w:val="24"/>
           <w:szCs w:val="24"/>
         </w:rPr>
-        <w:t xml:space="preserve">Tabla 2. Mapeo MITRE ATT&amp;CK esperado.</w:t>
-      </w:r>
-    </w:p>
-    <w:p>
-      <w:pPr>
-        <w:spacing w:line="360"/>
-      </w:pPr>
-      <w:r>
-        <w:rPr>
-          <w:rFonts w:ascii="Arial" w:cs="Arial" w:eastAsia="Arial" w:hAnsi="Arial"/>
-          <w:sz w:val="24"/>
-          <w:szCs w:val="24"/>
-        </w:rPr>
-        <w:t xml:space="preserve"/>
+        <w:t xml:space="preserve">Tabla 2. Catálogo de técnicas MITRE ATT&amp;CK del clasificador.</w:t>
       </w:r>
     </w:p>
     <w:p>
@@ -15803,7 +16999,26 @@
           <w:sz w:val="24"/>
           <w:szCs w:val="24"/>
         </w:rPr>
-        <w:t xml:space="preserve">Este mapeo se completará y validará con los datos reales capturados durante la fase de exposición del honeypot. Cada técnica se acompañará de la evidencia concreta extraída de los logs y de una recomendación defensiva específica.</w:t>
+        <w:t xml:space="preserve">Una versión anterior de esta tabla, elaborada a mano a partir de la literatura, incluía dos asignaciones que se corrigieron al construir el clasificador. Los intentos de autenticación se habían situado en la táctica Initial Access, cuando la fuerza bruta (T1110) pertenece a Credential Access; y las propias sesiones SSH se habían clasificado como movimiento lateral (T1021.004), cuando el honeypot es el punto de entrada del atacante y no una máquina desde la que se desplace hacia otras. Asimismo, el acceso con las credenciales de root se reasignó de Default Accounts (T1078.001) a Local Accounts (T1078.003).</w:t>
+      </w:r>
+    </w:p>
+    <w:p>
+      <w:pPr>
+        <w:spacing w:line="360"/>
+        <w:ind w:firstLine="709"/>
+        <w:jc w:val="left"/>
+      </w:pPr>
+      <w:r>
+        <w:rPr>
+          <w:rFonts w:ascii="Arial" w:cs="Arial" w:eastAsia="Arial" w:hAnsi="Arial"/>
+          <w:b w:val="false"/>
+          <w:bCs w:val="false"/>
+          <w:i w:val="false"/>
+          <w:iCs w:val="false"/>
+          <w:sz w:val="24"/>
+          <w:szCs w:val="24"/>
+        </w:rPr>
+        <w:t xml:space="preserve">La tabla con los datos reales (sesiones, IPs y ejemplos de cada técnica) la genera el analizador al procesar los logs de la captura, y se incorporará al informe de inteligencia junto con las recomendaciones defensivas asociadas a cada técnica.</w:t>
       </w:r>
     </w:p>
     <w:p>
@@ -18302,6 +19517,74 @@
           </w:p>
         </w:tc>
       </w:tr>
+      <w:tr>
+        <w:tc>
+          <w:tcPr>
+            <w:tcW w:type="pct" w:w="1350"/>
+            <w:vAlign w:val="center"/>
+          </w:tcPr>
+          <w:p>
+            <w:pPr>
+              <w:spacing w:line="276"/>
+              <w:jc w:val="left"/>
+            </w:pPr>
+            <w:r>
+              <w:rPr>
+                <w:rFonts w:ascii="Arial" w:cs="Arial" w:eastAsia="Arial" w:hAnsi="Arial"/>
+                <w:b w:val="false"/>
+                <w:bCs w:val="false"/>
+                <w:sz w:val="20"/>
+                <w:szCs w:val="20"/>
+              </w:rPr>
+              <w:t xml:space="preserve">mapear (mitre_mapping.py)</w:t>
+            </w:r>
+          </w:p>
+        </w:tc>
+        <w:tc>
+          <w:tcPr>
+            <w:tcW w:type="pct" w:w="1650"/>
+            <w:vAlign w:val="center"/>
+          </w:tcPr>
+          <w:p>
+            <w:pPr>
+              <w:spacing w:line="276"/>
+              <w:jc w:val="left"/>
+            </w:pPr>
+            <w:r>
+              <w:rPr>
+                <w:rFonts w:ascii="Arial" w:cs="Arial" w:eastAsia="Arial" w:hAnsi="Arial"/>
+                <w:b w:val="false"/>
+                <w:bCs w:val="false"/>
+                <w:sz w:val="20"/>
+                <w:szCs w:val="20"/>
+              </w:rPr>
+              <w:t xml:space="preserve">login.failed / success, command.input</w:t>
+            </w:r>
+          </w:p>
+        </w:tc>
+        <w:tc>
+          <w:tcPr>
+            <w:tcW w:type="pct" w:w="2000"/>
+            <w:vAlign w:val="center"/>
+          </w:tcPr>
+          <w:p>
+            <w:pPr>
+              <w:spacing w:line="276"/>
+              <w:jc w:val="left"/>
+            </w:pPr>
+            <w:r>
+              <w:rPr>
+                <w:rFonts w:ascii="Arial" w:cs="Arial" w:eastAsia="Arial" w:hAnsi="Arial"/>
+                <w:b w:val="false"/>
+                <w:bCs w:val="false"/>
+                <w:sz w:val="20"/>
+                <w:szCs w:val="20"/>
+              </w:rPr>
+              <w:t xml:space="preserve">Técnicas MITRE ATT&amp;CK con evidencias</w:t>
+            </w:r>
+          </w:p>
+        </w:tc>
+      </w:tr>
     </w:tbl>
     <w:p>
       <w:pPr>
@@ -18338,6 +19621,196 @@
           <w:szCs w:val="24"/>
         </w:rPr>
         <w:t xml:space="preserve">La función analyze_command_urls se añadió tras las pruebas con Cowrie real. Cowrie solo registra un evento de descarga cuando el fichero se descarga con éxito, pero en la práctica muchos servidores de malware de las botnets ya han sido retirados cuando el bot ejecuta el comando wget o curl. Esas URLs siguen siendo indicadores de compromiso (IOC) útiles para el informe de inteligencia, así que la función las extrae directamente del texto de los comandos mediante una expresión regular.</w:t>
+      </w:r>
+    </w:p>
+    <w:p>
+      <w:pPr>
+        <w:pStyle w:val="Heading2"/>
+        <w:spacing w:after="240" w:before="240" w:line="360"/>
+        <w:jc w:val="left"/>
+      </w:pPr>
+      <w:r>
+        <w:rPr>
+          <w:rFonts w:ascii="Arial" w:cs="Arial" w:eastAsia="Arial" w:hAnsi="Arial"/>
+          <w:b/>
+          <w:bCs/>
+          <w:sz w:val="24"/>
+          <w:szCs w:val="24"/>
+        </w:rPr>
+        <w:t xml:space="preserve">Clasificación Automática en MITRE ATT&amp;CK</w:t>
+      </w:r>
+    </w:p>
+    <w:p>
+      <w:pPr>
+        <w:spacing w:line="360"/>
+        <w:ind w:firstLine="709"/>
+        <w:jc w:val="left"/>
+      </w:pPr>
+      <w:r>
+        <w:rPr>
+          <w:rFonts w:ascii="Arial" w:cs="Arial" w:eastAsia="Arial" w:hAnsi="Arial"/>
+          <w:b w:val="false"/>
+          <w:bCs w:val="false"/>
+          <w:i w:val="false"/>
+          <w:iCs w:val="false"/>
+          <w:sz w:val="24"/>
+          <w:szCs w:val="24"/>
+        </w:rPr>
+        <w:t xml:space="preserve">La clasificación de la actividad observada se ha automatizado en un módulo independiente, mitre_mapping.py, que el analizador utiliza en cada ejecución. Hacerlo a mano sobre miles de eventos sería lento y propenso a errores; automatizarlo permite además repetir el análisis cada vez que se descargan logs nuevos durante el periodo de captura.</w:t>
+      </w:r>
+    </w:p>
+    <w:p>
+      <w:pPr>
+        <w:spacing w:line="360"/>
+        <w:ind w:firstLine="709"/>
+        <w:jc w:val="left"/>
+      </w:pPr>
+      <w:r>
+        <w:rPr>
+          <w:rFonts w:ascii="Arial" w:cs="Arial" w:eastAsia="Arial" w:hAnsi="Arial"/>
+          <w:b w:val="false"/>
+          <w:bCs w:val="false"/>
+          <w:i w:val="false"/>
+          <w:iCs w:val="false"/>
+          <w:sz w:val="24"/>
+          <w:szCs w:val="24"/>
+        </w:rPr>
+        <w:t xml:space="preserve">El módulo define un catálogo de reglas (Tabla 2), cada una formada por el identificador de la técnica, su nombre oficial, la táctica a la que pertenece, una expresión regular que reconoce los indicadores en el texto del comando y una recomendación defensiva, con la referencia a la mitigación de ATT&amp;CK (M1022, M1027, M1029...) cuando el marco la define. Las decisiones de diseño más relevantes son:</w:t>
+      </w:r>
+    </w:p>
+    <w:p>
+      <w:pPr>
+        <w:pStyle w:val="ListParagraph"/>
+        <w:numPr>
+          <w:ilvl w:val="0"/>
+          <w:numId w:val="1"/>
+        </w:numPr>
+        <w:spacing w:line="360"/>
+        <w:ind w:left="720" w:hanging="357"/>
+      </w:pPr>
+      <w:r>
+        <w:rPr>
+          <w:rFonts w:ascii="Arial" w:cs="Arial" w:eastAsia="Arial" w:hAnsi="Arial"/>
+          <w:b/>
+          <w:bCs/>
+          <w:sz w:val="24"/>
+          <w:szCs w:val="24"/>
+        </w:rPr>
+        <w:t xml:space="preserve">Un comando puede corresponder a varias técnicas. </w:t>
+      </w:r>
+      <w:r>
+        <w:rPr>
+          <w:rFonts w:ascii="Arial" w:cs="Arial" w:eastAsia="Arial" w:hAnsi="Arial"/>
+          <w:sz w:val="24"/>
+          <w:szCs w:val="24"/>
+        </w:rPr>
+        <w:t xml:space="preserve">Los bots suelen encadenar órdenes en una sola línea (cd /tmp; wget ...; chmod +x ...; ./bot). Cada regla se evalúa por separado sobre el comando completo, de modo que esa línea suma a la vez a T1105, T1222.002 y T1059.004.</w:t>
+      </w:r>
+    </w:p>
+    <w:p>
+      <w:pPr>
+        <w:pStyle w:val="ListParagraph"/>
+        <w:numPr>
+          <w:ilvl w:val="0"/>
+          <w:numId w:val="1"/>
+        </w:numPr>
+        <w:spacing w:line="360"/>
+        <w:ind w:left="720" w:hanging="357"/>
+      </w:pPr>
+      <w:r>
+        <w:rPr>
+          <w:rFonts w:ascii="Arial" w:cs="Arial" w:eastAsia="Arial" w:hAnsi="Arial"/>
+          <w:b/>
+          <w:bCs/>
+          <w:sz w:val="24"/>
+          <w:szCs w:val="24"/>
+        </w:rPr>
+        <w:t xml:space="preserve">La autenticación se clasifica por tipo de evento, no por texto. </w:t>
+      </w:r>
+      <w:r>
+        <w:rPr>
+          <w:rFonts w:ascii="Arial" w:cs="Arial" w:eastAsia="Arial" w:hAnsi="Arial"/>
+          <w:sz w:val="24"/>
+          <w:szCs w:val="24"/>
+        </w:rPr>
+        <w:t xml:space="preserve">Los eventos cowrie.login.failed se asignan a T1110.001 (fuerza bruta) y los cowrie.login.success a T1078.003 (uso de cuentas válidas), con la credencial empleada como evidencia.</w:t>
+      </w:r>
+    </w:p>
+    <w:p>
+      <w:pPr>
+        <w:pStyle w:val="ListParagraph"/>
+        <w:numPr>
+          <w:ilvl w:val="0"/>
+          <w:numId w:val="1"/>
+        </w:numPr>
+        <w:spacing w:line="360"/>
+        <w:ind w:left="720" w:hanging="357"/>
+      </w:pPr>
+      <w:r>
+        <w:rPr>
+          <w:rFonts w:ascii="Arial" w:cs="Arial" w:eastAsia="Arial" w:hAnsi="Arial"/>
+          <w:b/>
+          <w:bCs/>
+          <w:sz w:val="24"/>
+          <w:szCs w:val="24"/>
+        </w:rPr>
+        <w:t xml:space="preserve">Se cuentan sesiones e IPs, no solo eventos. </w:t>
+      </w:r>
+      <w:r>
+        <w:rPr>
+          <w:rFonts w:ascii="Arial" w:cs="Arial" w:eastAsia="Arial" w:hAnsi="Arial"/>
+          <w:sz w:val="24"/>
+          <w:szCs w:val="24"/>
+        </w:rPr>
+        <w:t xml:space="preserve">Un mismo bot puede repetir un comando muchas veces en una sesión. El número de sesiones distintas y de IPs distintas que usan cada técnica refleja mejor su prevalencia real entre los atacantes.</w:t>
+      </w:r>
+    </w:p>
+    <w:p>
+      <w:pPr>
+        <w:pStyle w:val="ListParagraph"/>
+        <w:numPr>
+          <w:ilvl w:val="0"/>
+          <w:numId w:val="1"/>
+        </w:numPr>
+        <w:spacing w:line="360"/>
+        <w:ind w:left="720" w:hanging="357"/>
+      </w:pPr>
+      <w:r>
+        <w:rPr>
+          <w:rFonts w:ascii="Arial" w:cs="Arial" w:eastAsia="Arial" w:hAnsi="Arial"/>
+          <w:b/>
+          <w:bCs/>
+          <w:sz w:val="24"/>
+          <w:szCs w:val="24"/>
+        </w:rPr>
+        <w:t xml:space="preserve">Lo que no se clasifica se muestra. </w:t>
+      </w:r>
+      <w:r>
+        <w:rPr>
+          <w:rFonts w:ascii="Arial" w:cs="Arial" w:eastAsia="Arial" w:hAnsi="Arial"/>
+          <w:sz w:val="24"/>
+          <w:szCs w:val="24"/>
+        </w:rPr>
+        <w:t xml:space="preserve">Los comandos que no encajan en ninguna regla aparecen en una sección propia del informe para su revisión manual. Así, una técnica que el catálogo no contemple no se pierde en silencio, y la revisión permite ampliar las reglas.</w:t>
+      </w:r>
+    </w:p>
+    <w:p>
+      <w:pPr>
+        <w:spacing w:line="360"/>
+        <w:ind w:firstLine="709"/>
+        <w:jc w:val="left"/>
+      </w:pPr>
+      <w:r>
+        <w:rPr>
+          <w:rFonts w:ascii="Arial" w:cs="Arial" w:eastAsia="Arial" w:hAnsi="Arial"/>
+          <w:b w:val="false"/>
+          <w:bCs w:val="false"/>
+          <w:i w:val="false"/>
+          <w:iCs w:val="false"/>
+          <w:sz w:val="24"/>
+          <w:szCs w:val="24"/>
+        </w:rPr>
+        <w:t xml:space="preserve">El resultado se entrega en tres formatos: una sección del informe de texto agrupada por tácticas en el orden de la matriz de ATT&amp;CK, una gráfica de sesiones por técnica y un fichero CSV (mitre_mapping.csv) con táctica, identificador, nombre, sesiones, eventos, IPs, ejemplo y recomendación, que se abre directamente en una hoja de cálculo y sirve de base para las tablas del informe de inteligencia.</w:t>
       </w:r>
     </w:p>
     <w:p>
@@ -20356,6 +21829,657 @@
           <w:sz w:val="24"/>
           <w:szCs w:val="24"/>
         </w:rPr>
+        <w:t xml:space="preserve">Prueba del Clasificador MITRE ATT&amp;CK</w:t>
+      </w:r>
+    </w:p>
+    <w:p>
+      <w:pPr>
+        <w:spacing w:line="360"/>
+        <w:ind w:firstLine="709"/>
+        <w:jc w:val="left"/>
+      </w:pPr>
+      <w:r>
+        <w:rPr>
+          <w:rFonts w:ascii="Arial" w:cs="Arial" w:eastAsia="Arial" w:hAnsi="Arial"/>
+          <w:b w:val="false"/>
+          <w:bCs w:val="false"/>
+          <w:i w:val="false"/>
+          <w:iCs w:val="false"/>
+          <w:sz w:val="24"/>
+          <w:szCs w:val="24"/>
+        </w:rPr>
+        <w:t xml:space="preserve">El clasificador se prueba con un conjunto de 33 casos recogido en el fichero test_mitre_mapping.py, que puede ejecutarse de nuevo cada vez que se modifiquen las reglas. Los casos incluyen los comandos típicos de los bots y, sobre todo, posibles falsos positivos: las expresiones regulares cortas son propensas a encontrar coincidencias donde no las hay.</w:t>
+      </w:r>
+    </w:p>
+    <w:tbl>
+      <w:tblPr>
+        <w:tblW w:type="pct" w:w="5000"/>
+        <w:tblBorders>
+          <w:top w:val="single" w:color="auto" w:sz="4"/>
+          <w:left w:val="single" w:color="auto" w:sz="4"/>
+          <w:bottom w:val="single" w:color="auto" w:sz="4"/>
+          <w:right w:val="single" w:color="auto" w:sz="4"/>
+          <w:insideH w:val="single" w:color="auto" w:sz="4"/>
+          <w:insideV w:val="single" w:color="auto" w:sz="4"/>
+        </w:tblBorders>
+      </w:tblPr>
+      <w:tblGrid>
+        <w:gridCol w:w="3016"/>
+        <w:gridCol w:w="2937"/>
+        <w:gridCol w:w="1985"/>
+      </w:tblGrid>
+      <w:tr>
+        <w:trPr>
+          <w:tblHeader/>
+        </w:trPr>
+        <w:tc>
+          <w:tcPr>
+            <w:tcW w:type="pct" w:w="1900"/>
+            <w:shd w:fill="D9E2F3" w:color="D9E2F3" w:val="solid"/>
+            <w:vAlign w:val="center"/>
+          </w:tcPr>
+          <w:p>
+            <w:pPr>
+              <w:spacing w:line="276"/>
+              <w:jc w:val="left"/>
+            </w:pPr>
+            <w:r>
+              <w:rPr>
+                <w:rFonts w:ascii="Arial" w:cs="Arial" w:eastAsia="Arial" w:hAnsi="Arial"/>
+                <w:b/>
+                <w:bCs/>
+                <w:sz w:val="20"/>
+                <w:szCs w:val="20"/>
+              </w:rPr>
+              <w:t xml:space="preserve">Comando</w:t>
+            </w:r>
+          </w:p>
+        </w:tc>
+        <w:tc>
+          <w:tcPr>
+            <w:tcW w:type="pct" w:w="1850"/>
+            <w:shd w:fill="D9E2F3" w:color="D9E2F3" w:val="solid"/>
+            <w:vAlign w:val="center"/>
+          </w:tcPr>
+          <w:p>
+            <w:pPr>
+              <w:spacing w:line="276"/>
+              <w:jc w:val="left"/>
+            </w:pPr>
+            <w:r>
+              <w:rPr>
+                <w:rFonts w:ascii="Arial" w:cs="Arial" w:eastAsia="Arial" w:hAnsi="Arial"/>
+                <w:b/>
+                <w:bCs/>
+                <w:sz w:val="20"/>
+                <w:szCs w:val="20"/>
+              </w:rPr>
+              <w:t xml:space="preserve">Riesgo</w:t>
+            </w:r>
+          </w:p>
+        </w:tc>
+        <w:tc>
+          <w:tcPr>
+            <w:tcW w:type="pct" w:w="1250"/>
+            <w:shd w:fill="D9E2F3" w:color="D9E2F3" w:val="solid"/>
+            <w:vAlign w:val="center"/>
+          </w:tcPr>
+          <w:p>
+            <w:pPr>
+              <w:spacing w:line="276"/>
+              <w:jc w:val="left"/>
+            </w:pPr>
+            <w:r>
+              <w:rPr>
+                <w:rFonts w:ascii="Arial" w:cs="Arial" w:eastAsia="Arial" w:hAnsi="Arial"/>
+                <w:b/>
+                <w:bCs/>
+                <w:sz w:val="20"/>
+                <w:szCs w:val="20"/>
+              </w:rPr>
+              <w:t xml:space="preserve">Técnicas obtenidas</w:t>
+            </w:r>
+          </w:p>
+        </w:tc>
+      </w:tr>
+      <w:tr>
+        <w:tc>
+          <w:tcPr>
+            <w:tcW w:type="pct" w:w="1900"/>
+            <w:vAlign w:val="center"/>
+          </w:tcPr>
+          <w:p>
+            <w:pPr>
+              <w:spacing w:line="276"/>
+              <w:jc w:val="left"/>
+            </w:pPr>
+            <w:r>
+              <w:rPr>
+                <w:rFonts w:ascii="Arial" w:cs="Arial" w:eastAsia="Arial" w:hAnsi="Arial"/>
+                <w:b w:val="false"/>
+                <w:bCs w:val="false"/>
+                <w:sz w:val="20"/>
+                <w:szCs w:val="20"/>
+              </w:rPr>
+              <w:t xml:space="preserve">wget http://.../bot.x86 -O /tmp/bot</w:t>
+            </w:r>
+          </w:p>
+        </w:tc>
+        <w:tc>
+          <w:tcPr>
+            <w:tcW w:type="pct" w:w="1850"/>
+            <w:vAlign w:val="center"/>
+          </w:tcPr>
+          <w:p>
+            <w:pPr>
+              <w:spacing w:line="276"/>
+              <w:jc w:val="left"/>
+            </w:pPr>
+            <w:r>
+              <w:rPr>
+                <w:rFonts w:ascii="Arial" w:cs="Arial" w:eastAsia="Arial" w:hAnsi="Arial"/>
+                <w:b w:val="false"/>
+                <w:bCs w:val="false"/>
+                <w:sz w:val="20"/>
+                <w:szCs w:val="20"/>
+              </w:rPr>
+              <w:t xml:space="preserve">Que la «w» se confunda con el comando w (T1033)</w:t>
+            </w:r>
+          </w:p>
+        </w:tc>
+        <w:tc>
+          <w:tcPr>
+            <w:tcW w:type="pct" w:w="1250"/>
+            <w:vAlign w:val="center"/>
+          </w:tcPr>
+          <w:p>
+            <w:pPr>
+              <w:spacing w:line="276"/>
+              <w:jc w:val="left"/>
+            </w:pPr>
+            <w:r>
+              <w:rPr>
+                <w:rFonts w:ascii="Arial" w:cs="Arial" w:eastAsia="Arial" w:hAnsi="Arial"/>
+                <w:b w:val="false"/>
+                <w:bCs w:val="false"/>
+                <w:sz w:val="20"/>
+                <w:szCs w:val="20"/>
+              </w:rPr>
+              <w:t xml:space="preserve">Solo T1105</w:t>
+            </w:r>
+          </w:p>
+        </w:tc>
+      </w:tr>
+      <w:tr>
+        <w:tc>
+          <w:tcPr>
+            <w:tcW w:type="pct" w:w="1900"/>
+            <w:vAlign w:val="center"/>
+          </w:tcPr>
+          <w:p>
+            <w:pPr>
+              <w:spacing w:line="276"/>
+              <w:jc w:val="left"/>
+            </w:pPr>
+            <w:r>
+              <w:rPr>
+                <w:rFonts w:ascii="Arial" w:cs="Arial" w:eastAsia="Arial" w:hAnsi="Arial"/>
+                <w:b w:val="false"/>
+                <w:bCs w:val="false"/>
+                <w:sz w:val="20"/>
+                <w:szCs w:val="20"/>
+              </w:rPr>
+              <w:t xml:space="preserve">pidof sshd</w:t>
+            </w:r>
+          </w:p>
+        </w:tc>
+        <w:tc>
+          <w:tcPr>
+            <w:tcW w:type="pct" w:w="1850"/>
+            <w:vAlign w:val="center"/>
+          </w:tcPr>
+          <w:p>
+            <w:pPr>
+              <w:spacing w:line="276"/>
+              <w:jc w:val="left"/>
+            </w:pPr>
+            <w:r>
+              <w:rPr>
+                <w:rFonts w:ascii="Arial" w:cs="Arial" w:eastAsia="Arial" w:hAnsi="Arial"/>
+                <w:b w:val="false"/>
+                <w:bCs w:val="false"/>
+                <w:sz w:val="20"/>
+                <w:szCs w:val="20"/>
+              </w:rPr>
+              <w:t xml:space="preserve">Que contenga «id» y cuente como T1033</w:t>
+            </w:r>
+          </w:p>
+        </w:tc>
+        <w:tc>
+          <w:tcPr>
+            <w:tcW w:type="pct" w:w="1250"/>
+            <w:vAlign w:val="center"/>
+          </w:tcPr>
+          <w:p>
+            <w:pPr>
+              <w:spacing w:line="276"/>
+              <w:jc w:val="left"/>
+            </w:pPr>
+            <w:r>
+              <w:rPr>
+                <w:rFonts w:ascii="Arial" w:cs="Arial" w:eastAsia="Arial" w:hAnsi="Arial"/>
+                <w:b w:val="false"/>
+                <w:bCs w:val="false"/>
+                <w:sz w:val="20"/>
+                <w:szCs w:val="20"/>
+              </w:rPr>
+              <w:t xml:space="preserve">Solo T1057</w:t>
+            </w:r>
+          </w:p>
+        </w:tc>
+      </w:tr>
+      <w:tr>
+        <w:tc>
+          <w:tcPr>
+            <w:tcW w:type="pct" w:w="1900"/>
+            <w:vAlign w:val="center"/>
+          </w:tcPr>
+          <w:p>
+            <w:pPr>
+              <w:spacing w:line="276"/>
+              <w:jc w:val="left"/>
+            </w:pPr>
+            <w:r>
+              <w:rPr>
+                <w:rFonts w:ascii="Arial" w:cs="Arial" w:eastAsia="Arial" w:hAnsi="Arial"/>
+                <w:b w:val="false"/>
+                <w:bCs w:val="false"/>
+                <w:sz w:val="20"/>
+                <w:szCs w:val="20"/>
+              </w:rPr>
+              <w:t xml:space="preserve">crontab -l</w:t>
+            </w:r>
+          </w:p>
+        </w:tc>
+        <w:tc>
+          <w:tcPr>
+            <w:tcW w:type="pct" w:w="1850"/>
+            <w:vAlign w:val="center"/>
+          </w:tcPr>
+          <w:p>
+            <w:pPr>
+              <w:spacing w:line="276"/>
+              <w:jc w:val="left"/>
+            </w:pPr>
+            <w:r>
+              <w:rPr>
+                <w:rFonts w:ascii="Arial" w:cs="Arial" w:eastAsia="Arial" w:hAnsi="Arial"/>
+                <w:b w:val="false"/>
+                <w:bCs w:val="false"/>
+                <w:sz w:val="20"/>
+                <w:szCs w:val="20"/>
+              </w:rPr>
+              <w:t xml:space="preserve">Que listar tareas cuente como persistencia</w:t>
+            </w:r>
+          </w:p>
+        </w:tc>
+        <w:tc>
+          <w:tcPr>
+            <w:tcW w:type="pct" w:w="1250"/>
+            <w:vAlign w:val="center"/>
+          </w:tcPr>
+          <w:p>
+            <w:pPr>
+              <w:spacing w:line="276"/>
+              <w:jc w:val="left"/>
+            </w:pPr>
+            <w:r>
+              <w:rPr>
+                <w:rFonts w:ascii="Arial" w:cs="Arial" w:eastAsia="Arial" w:hAnsi="Arial"/>
+                <w:b w:val="false"/>
+                <w:bCs w:val="false"/>
+                <w:sz w:val="20"/>
+                <w:szCs w:val="20"/>
+              </w:rPr>
+              <w:t xml:space="preserve">Ninguna propia</w:t>
+            </w:r>
+          </w:p>
+        </w:tc>
+      </w:tr>
+      <w:tr>
+        <w:tc>
+          <w:tcPr>
+            <w:tcW w:type="pct" w:w="1900"/>
+            <w:vAlign w:val="center"/>
+          </w:tcPr>
+          <w:p>
+            <w:pPr>
+              <w:spacing w:line="276"/>
+              <w:jc w:val="left"/>
+            </w:pPr>
+            <w:r>
+              <w:rPr>
+                <w:rFonts w:ascii="Arial" w:cs="Arial" w:eastAsia="Arial" w:hAnsi="Arial"/>
+                <w:b w:val="false"/>
+                <w:bCs w:val="false"/>
+                <w:sz w:val="20"/>
+                <w:szCs w:val="20"/>
+              </w:rPr>
+              <w:t xml:space="preserve">(crontab -l; echo '...') | crontab -</w:t>
+            </w:r>
+          </w:p>
+        </w:tc>
+        <w:tc>
+          <w:tcPr>
+            <w:tcW w:type="pct" w:w="1850"/>
+            <w:vAlign w:val="center"/>
+          </w:tcPr>
+          <w:p>
+            <w:pPr>
+              <w:spacing w:line="276"/>
+              <w:jc w:val="left"/>
+            </w:pPr>
+            <w:r>
+              <w:rPr>
+                <w:rFonts w:ascii="Arial" w:cs="Arial" w:eastAsia="Arial" w:hAnsi="Arial"/>
+                <w:b w:val="false"/>
+                <w:bCs w:val="false"/>
+                <w:sz w:val="20"/>
+                <w:szCs w:val="20"/>
+              </w:rPr>
+              <w:t xml:space="preserve">Que no se detecte la instalación de la tarea</w:t>
+            </w:r>
+          </w:p>
+        </w:tc>
+        <w:tc>
+          <w:tcPr>
+            <w:tcW w:type="pct" w:w="1250"/>
+            <w:vAlign w:val="center"/>
+          </w:tcPr>
+          <w:p>
+            <w:pPr>
+              <w:spacing w:line="276"/>
+              <w:jc w:val="left"/>
+            </w:pPr>
+            <w:r>
+              <w:rPr>
+                <w:rFonts w:ascii="Arial" w:cs="Arial" w:eastAsia="Arial" w:hAnsi="Arial"/>
+                <w:b w:val="false"/>
+                <w:bCs w:val="false"/>
+                <w:sz w:val="20"/>
+                <w:szCs w:val="20"/>
+              </w:rPr>
+              <w:t xml:space="preserve">T1053.003</w:t>
+            </w:r>
+          </w:p>
+        </w:tc>
+      </w:tr>
+      <w:tr>
+        <w:tc>
+          <w:tcPr>
+            <w:tcW w:type="pct" w:w="1900"/>
+            <w:vAlign w:val="center"/>
+          </w:tcPr>
+          <w:p>
+            <w:pPr>
+              <w:spacing w:line="276"/>
+              <w:jc w:val="left"/>
+            </w:pPr>
+            <w:r>
+              <w:rPr>
+                <w:rFonts w:ascii="Arial" w:cs="Arial" w:eastAsia="Arial" w:hAnsi="Arial"/>
+                <w:b w:val="false"/>
+                <w:bCs w:val="false"/>
+                <w:sz w:val="20"/>
+                <w:szCs w:val="20"/>
+              </w:rPr>
+              <w:t xml:space="preserve">curl http://.../miner.sh -o /tmp/miner.sh</w:t>
+            </w:r>
+          </w:p>
+        </w:tc>
+        <w:tc>
+          <w:tcPr>
+            <w:tcW w:type="pct" w:w="1850"/>
+            <w:vAlign w:val="center"/>
+          </w:tcPr>
+          <w:p>
+            <w:pPr>
+              <w:spacing w:line="276"/>
+              <w:jc w:val="left"/>
+            </w:pPr>
+            <w:r>
+              <w:rPr>
+                <w:rFonts w:ascii="Arial" w:cs="Arial" w:eastAsia="Arial" w:hAnsi="Arial"/>
+                <w:b w:val="false"/>
+                <w:bCs w:val="false"/>
+                <w:sz w:val="20"/>
+                <w:szCs w:val="20"/>
+              </w:rPr>
+              <w:t xml:space="preserve">Que solo se detecte la descarga</w:t>
+            </w:r>
+          </w:p>
+        </w:tc>
+        <w:tc>
+          <w:tcPr>
+            <w:tcW w:type="pct" w:w="1250"/>
+            <w:vAlign w:val="center"/>
+          </w:tcPr>
+          <w:p>
+            <w:pPr>
+              <w:spacing w:line="276"/>
+              <w:jc w:val="left"/>
+            </w:pPr>
+            <w:r>
+              <w:rPr>
+                <w:rFonts w:ascii="Arial" w:cs="Arial" w:eastAsia="Arial" w:hAnsi="Arial"/>
+                <w:b w:val="false"/>
+                <w:bCs w:val="false"/>
+                <w:sz w:val="20"/>
+                <w:szCs w:val="20"/>
+              </w:rPr>
+              <w:t xml:space="preserve">T1105 y T1496.001</w:t>
+            </w:r>
+          </w:p>
+        </w:tc>
+      </w:tr>
+      <w:tr>
+        <w:tc>
+          <w:tcPr>
+            <w:tcW w:type="pct" w:w="1900"/>
+            <w:vAlign w:val="center"/>
+          </w:tcPr>
+          <w:p>
+            <w:pPr>
+              <w:spacing w:line="276"/>
+              <w:jc w:val="left"/>
+            </w:pPr>
+            <w:r>
+              <w:rPr>
+                <w:rFonts w:ascii="Arial" w:cs="Arial" w:eastAsia="Arial" w:hAnsi="Arial"/>
+                <w:b w:val="false"/>
+                <w:bCs w:val="false"/>
+                <w:sz w:val="20"/>
+                <w:szCs w:val="20"/>
+              </w:rPr>
+              <w:t xml:space="preserve">echo hidden / cat /tmp/window.txt</w:t>
+            </w:r>
+          </w:p>
+        </w:tc>
+        <w:tc>
+          <w:tcPr>
+            <w:tcW w:type="pct" w:w="1850"/>
+            <w:vAlign w:val="center"/>
+          </w:tcPr>
+          <w:p>
+            <w:pPr>
+              <w:spacing w:line="276"/>
+              <w:jc w:val="left"/>
+            </w:pPr>
+            <w:r>
+              <w:rPr>
+                <w:rFonts w:ascii="Arial" w:cs="Arial" w:eastAsia="Arial" w:hAnsi="Arial"/>
+                <w:b w:val="false"/>
+                <w:bCs w:val="false"/>
+                <w:sz w:val="20"/>
+                <w:szCs w:val="20"/>
+              </w:rPr>
+              <w:t xml:space="preserve">Coincidencias parciales («id», «w»)</w:t>
+            </w:r>
+          </w:p>
+        </w:tc>
+        <w:tc>
+          <w:tcPr>
+            <w:tcW w:type="pct" w:w="1250"/>
+            <w:vAlign w:val="center"/>
+          </w:tcPr>
+          <w:p>
+            <w:pPr>
+              <w:spacing w:line="276"/>
+              <w:jc w:val="left"/>
+            </w:pPr>
+            <w:r>
+              <w:rPr>
+                <w:rFonts w:ascii="Arial" w:cs="Arial" w:eastAsia="Arial" w:hAnsi="Arial"/>
+                <w:b w:val="false"/>
+                <w:bCs w:val="false"/>
+                <w:sz w:val="20"/>
+                <w:szCs w:val="20"/>
+              </w:rPr>
+              <w:t xml:space="preserve">Ninguna</w:t>
+            </w:r>
+          </w:p>
+        </w:tc>
+      </w:tr>
+    </w:tbl>
+    <w:p>
+      <w:pPr>
+        <w:spacing w:after="240" w:before="60" w:line="360"/>
+        <w:jc w:val="center"/>
+      </w:pPr>
+      <w:r>
+        <w:rPr>
+          <w:rFonts w:ascii="Arial" w:cs="Arial" w:eastAsia="Arial" w:hAnsi="Arial"/>
+          <w:b/>
+          <w:bCs/>
+          <w:i w:val="false"/>
+          <w:iCs w:val="false"/>
+          <w:sz w:val="24"/>
+          <w:szCs w:val="24"/>
+        </w:rPr>
+        <w:t xml:space="preserve">Tabla 9. Casos de prueba del clasificador con riesgo de error.</w:t>
+      </w:r>
+    </w:p>
+    <w:p>
+      <w:pPr>
+        <w:spacing w:line="360"/>
+        <w:ind w:firstLine="709"/>
+        <w:jc w:val="left"/>
+      </w:pPr>
+      <w:r>
+        <w:rPr>
+          <w:rFonts w:ascii="Arial" w:cs="Arial" w:eastAsia="Arial" w:hAnsi="Arial"/>
+          <w:b w:val="false"/>
+          <w:bCs w:val="false"/>
+          <w:i w:val="false"/>
+          <w:iCs w:val="false"/>
+          <w:sz w:val="24"/>
+          <w:szCs w:val="24"/>
+        </w:rPr>
+        <w:t xml:space="preserve">Los 33 casos se clasificaron correctamente. A continuación se ejecutó el analizador completo sobre las 500 sesiones simuladas: identificó 15 técnicas pertenecientes a 8 tácticas, y solo tres comandos quedaron sin técnica propia (cd /tmp, crontab -l y la ejecución directa de /tmp/bot), que efectivamente no corresponden a ninguna técnica distinta de la ejecución en shell. La Figura 4 muestra la gráfica generada. Debe interpretarse solo como validación del funcionamiento, ya que los datos son sintéticos; los resultados reales se presentarán en el informe de inteligencia.</w:t>
+      </w:r>
+    </w:p>
+    <w:p>
+      <w:pPr>
+        <w:keepNext/>
+        <w:spacing w:before="240" w:line="360"/>
+      </w:pPr>
+      <w:r>
+        <w:rPr>
+          <w:rFonts w:ascii="Arial" w:cs="Arial" w:eastAsia="Arial" w:hAnsi="Arial"/>
+          <w:b/>
+          <w:bCs/>
+          <w:sz w:val="24"/>
+          <w:szCs w:val="24"/>
+        </w:rPr>
+        <w:t xml:space="preserve">Figura 4</w:t>
+      </w:r>
+    </w:p>
+    <w:p>
+      <w:pPr>
+        <w:keepNext/>
+        <w:spacing w:line="360"/>
+      </w:pPr>
+      <w:r>
+        <w:rPr>
+          <w:rFonts w:ascii="Arial" w:cs="Arial" w:eastAsia="Arial" w:hAnsi="Arial"/>
+          <w:i/>
+          <w:iCs/>
+          <w:sz w:val="24"/>
+          <w:szCs w:val="24"/>
+        </w:rPr>
+        <w:t xml:space="preserve">Técnicas MITRE ATT&amp;CK en los datos simulados (sesiones por técnica)</w:t>
+      </w:r>
+    </w:p>
+    <w:p>
+      <w:pPr>
+        <w:spacing w:after="120" w:line="240" w:lineRule="auto"/>
+        <w:jc w:val="center"/>
+      </w:pPr>
+      <w:r>
+        <w:drawing>
+          <wp:inline distT="0" distB="0" distL="0" distR="0">
+            <wp:extent cx="4762500" cy="3305175"/>
+            <wp:effectExtent t="0" r="0" b="0" l="0"/>
+            <wp:docPr id="6" name="" descr="" title=""/>
+            <wp:cNvGraphicFramePr>
+              <a:graphicFrameLocks xmlns:a="http://schemas.openxmlformats.org/drawingml/2006/main" noChangeAspect="1"/>
+            </wp:cNvGraphicFramePr>
+            <a:graphic xmlns:a="http://schemas.openxmlformats.org/drawingml/2006/main">
+              <a:graphicData uri="http://schemas.openxmlformats.org/drawingml/2006/picture">
+                <pic:pic xmlns:pic="http://schemas.openxmlformats.org/drawingml/2006/picture">
+                  <pic:nvPicPr>
+                    <pic:cNvPr id="0" name="" descr=""/>
+                    <pic:cNvPicPr>
+                      <a:picLocks noChangeAspect="1" noChangeArrowheads="1"/>
+                    </pic:cNvPicPr>
+                  </pic:nvPicPr>
+                  <pic:blipFill>
+                    <a:blip r:embed="rId14" cstate="none"/>
+                    <a:srcRect/>
+                    <a:stretch>
+                      <a:fillRect/>
+                    </a:stretch>
+                  </pic:blipFill>
+                  <pic:spPr bwMode="auto">
+                    <a:xfrm>
+                      <a:off x="0" y="0"/>
+                      <a:ext cx="4762500" cy="3305175"/>
+                    </a:xfrm>
+                    <a:prstGeom prst="rect">
+                      <a:avLst/>
+                    </a:prstGeom>
+                  </pic:spPr>
+                </pic:pic>
+              </a:graphicData>
+            </a:graphic>
+          </wp:inline>
+        </w:drawing>
+      </w:r>
+    </w:p>
+    <w:p>
+      <w:pPr>
+        <w:pStyle w:val="Heading2"/>
+        <w:spacing w:after="240" w:before="240" w:line="360"/>
+        <w:jc w:val="left"/>
+      </w:pPr>
+      <w:r>
+        <w:rPr>
+          <w:rFonts w:ascii="Arial" w:cs="Arial" w:eastAsia="Arial" w:hAnsi="Arial"/>
+          <w:b/>
+          <w:bCs/>
+          <w:sz w:val="24"/>
+          <w:szCs w:val="24"/>
+        </w:rPr>
         <w:t xml:space="preserve">Prueba de la Herramienta de Aprovisionamiento</w:t>
       </w:r>
     </w:p>
@@ -20893,7 +23017,7 @@
           <w:sz w:val="24"/>
           <w:szCs w:val="24"/>
         </w:rPr>
-        <w:t xml:space="preserve">Tabla 9. Pruebas del script de aprovisionamiento.</w:t>
+        <w:t xml:space="preserve">Tabla 10. Pruebas del script de aprovisionamiento.</w:t>
       </w:r>
     </w:p>
     <w:p>

</xml_diff>